<commit_message>
[194] Add summaries on top of Greek demotic drills tables
</commit_message>
<xml_diff>
--- a/site/drills/demotic-greek/answers.docx
+++ b/site/drills/demotic-greek/answers.docx
@@ -11,30 +11,137 @@
       </w:pPr>
       <w:r>
         <w:rPr/>
-        <w:t>=== Nouns ===</w:t>
-      </w:r>
-    </w:p>
-    <w:p>
-      <w:pPr>
-        <w:pStyle w:val="Normal"/>
-        <w:bidi w:val="0"/>
-        <w:jc w:val="left"/>
-        <w:rPr/>
-      </w:pPr>
-      <w:r>
-        <w:rPr/>
-      </w:r>
-    </w:p>
-    <w:p>
-      <w:pPr>
-        <w:pStyle w:val="Normal"/>
-        <w:bidi w:val="0"/>
-        <w:jc w:val="left"/>
-        <w:rPr/>
-      </w:pPr>
-      <w:r>
-        <w:rPr/>
-        <w:t>--- 1-st Group Masculine -ας, -ες ---</w:t>
+        <w:t>=== Nouns, Masculine ===</w:t>
+      </w:r>
+    </w:p>
+    <w:p>
+      <w:pPr>
+        <w:pStyle w:val="Normal"/>
+        <w:bidi w:val="0"/>
+        <w:jc w:val="left"/>
+        <w:rPr/>
+      </w:pPr>
+      <w:r>
+        <w:rPr/>
+      </w:r>
+    </w:p>
+    <w:p>
+      <w:pPr>
+        <w:pStyle w:val="Normal"/>
+        <w:bidi w:val="0"/>
+        <w:jc w:val="left"/>
+        <w:rPr/>
+      </w:pPr>
+      <w:r>
+        <w:rPr/>
+        <w:t>--- Noun Masculine in -ας, -ες πίνακας ---</w:t>
+      </w:r>
+    </w:p>
+    <w:p>
+      <w:pPr>
+        <w:pStyle w:val="Normal"/>
+        <w:bidi w:val="0"/>
+        <w:jc w:val="left"/>
+        <w:rPr/>
+      </w:pPr>
+      <w:r>
+        <w:rPr/>
+        <w:t>--- Noun Masculine in -ης, -ες μαθητής ---</w:t>
+      </w:r>
+    </w:p>
+    <w:p>
+      <w:pPr>
+        <w:pStyle w:val="Normal"/>
+        <w:bidi w:val="0"/>
+        <w:jc w:val="left"/>
+        <w:rPr/>
+      </w:pPr>
+      <w:r>
+        <w:rPr/>
+        <w:t>--- Noun Masculine in -ος, -οι φίλος ---</w:t>
+      </w:r>
+    </w:p>
+    <w:p>
+      <w:pPr>
+        <w:pStyle w:val="Normal"/>
+        <w:bidi w:val="0"/>
+        <w:jc w:val="left"/>
+        <w:rPr/>
+      </w:pPr>
+      <w:r>
+        <w:rPr/>
+        <w:t>--- Noun Masculine in -άς, -άδες ψαράς ---</w:t>
+      </w:r>
+    </w:p>
+    <w:p>
+      <w:pPr>
+        <w:pStyle w:val="Normal"/>
+        <w:bidi w:val="0"/>
+        <w:jc w:val="left"/>
+        <w:rPr/>
+      </w:pPr>
+      <w:r>
+        <w:rPr/>
+        <w:t>--- Noun Masculine in -ης, -ήδες βαρκάρης ---</w:t>
+      </w:r>
+    </w:p>
+    <w:p>
+      <w:pPr>
+        <w:pStyle w:val="Normal"/>
+        <w:bidi w:val="0"/>
+        <w:jc w:val="left"/>
+        <w:rPr/>
+      </w:pPr>
+      <w:r>
+        <w:rPr/>
+        <w:t>--- Noun Masculine in -ές, -έδες καφές ---</w:t>
+      </w:r>
+    </w:p>
+    <w:p>
+      <w:pPr>
+        <w:pStyle w:val="Normal"/>
+        <w:bidi w:val="0"/>
+        <w:jc w:val="left"/>
+        <w:rPr/>
+      </w:pPr>
+      <w:r>
+        <w:rPr/>
+        <w:t>--- Noun Masculine in -ούς, -ούδες παππούς ---</w:t>
+      </w:r>
+    </w:p>
+    <w:p>
+      <w:pPr>
+        <w:pStyle w:val="Normal"/>
+        <w:bidi w:val="0"/>
+        <w:jc w:val="left"/>
+        <w:rPr/>
+      </w:pPr>
+      <w:r>
+        <w:rPr/>
+        <w:t>--- Noun Masculine in -έας, -είς ιερέας ---</w:t>
+      </w:r>
+    </w:p>
+    <w:p>
+      <w:pPr>
+        <w:pStyle w:val="Normal"/>
+        <w:bidi w:val="0"/>
+        <w:jc w:val="left"/>
+        <w:rPr/>
+      </w:pPr>
+      <w:r>
+        <w:rPr/>
+      </w:r>
+    </w:p>
+    <w:p>
+      <w:pPr>
+        <w:pStyle w:val="Normal"/>
+        <w:bidi w:val="0"/>
+        <w:jc w:val="left"/>
+        <w:rPr/>
+      </w:pPr>
+      <w:r>
+        <w:rPr/>
+        <w:t>--- Noun Masculine -ας, -ες ---</w:t>
       </w:r>
     </w:p>
     <w:p>
@@ -81,7 +188,7 @@
       </w:pPr>
       <w:r>
         <w:rPr/>
-        <w:t>--- 1-st Group Masculine -ης, -ες ---</w:t>
+        <w:t>--- Noun Masculine -ης, -ες ---</w:t>
       </w:r>
     </w:p>
     <w:p>
@@ -128,7 +235,7 @@
       </w:pPr>
       <w:r>
         <w:rPr/>
-        <w:t>--- 2-nd Group Masculine -ος, -οι ---</w:t>
+        <w:t>--- Noun Masculine -ος, -οι ---</w:t>
       </w:r>
     </w:p>
     <w:p>
@@ -175,7 +282,7 @@
       </w:pPr>
       <w:r>
         <w:rPr/>
-        <w:t>--- 3-rd Group Masculine -άς, -άδες ---</w:t>
+        <w:t>--- Noun Masculine -άς, -άδες ---</w:t>
       </w:r>
     </w:p>
     <w:p>
@@ -222,7 +329,7 @@
       </w:pPr>
       <w:r>
         <w:rPr/>
-        <w:t>--- 3-rd Group Masculine -ής, -ήδες ---</w:t>
+        <w:t>--- Noun Masculine -ης, -ηδες ---</w:t>
       </w:r>
     </w:p>
     <w:p>
@@ -269,7 +376,7 @@
       </w:pPr>
       <w:r>
         <w:rPr/>
-        <w:t>--- 3-rd Group Masculine -ές, -έδες ---</w:t>
+        <w:t>--- Noun Masculine -ές, -έδες ---</w:t>
       </w:r>
     </w:p>
     <w:p>
@@ -316,7 +423,7 @@
       </w:pPr>
       <w:r>
         <w:rPr/>
-        <w:t>--- 3-rd Group Masculine -ούς, -ούδες ---</w:t>
+        <w:t>--- Noun Masculine -ούς, -ούδες ---</w:t>
       </w:r>
     </w:p>
     <w:p>
@@ -365,7 +472,7 @@
       </w:pPr>
       <w:r>
         <w:rPr/>
-        <w:t>--- 3-rd Group Masculine -έας, -είς ---</w:t>
+        <w:t>--- Noun Group Masculine -έας, -είς ---</w:t>
       </w:r>
     </w:p>
     <w:p>
@@ -412,7 +519,214 @@
       </w:pPr>
       <w:r>
         <w:rPr/>
-        <w:t>--- 1-st Group Feminine -ά, -ές ---</w:t>
+      </w:r>
+    </w:p>
+    <w:p>
+      <w:pPr>
+        <w:pStyle w:val="Normal"/>
+        <w:bidi w:val="0"/>
+        <w:jc w:val="left"/>
+        <w:rPr/>
+      </w:pPr>
+      <w:r>
+        <w:rPr/>
+      </w:r>
+    </w:p>
+    <w:p>
+      <w:pPr>
+        <w:pStyle w:val="Normal"/>
+        <w:bidi w:val="0"/>
+        <w:jc w:val="left"/>
+        <w:rPr/>
+      </w:pPr>
+      <w:r>
+        <w:rPr/>
+      </w:r>
+    </w:p>
+    <w:p>
+      <w:pPr>
+        <w:pStyle w:val="Normal"/>
+        <w:bidi w:val="0"/>
+        <w:jc w:val="left"/>
+        <w:rPr/>
+      </w:pPr>
+      <w:r>
+        <w:rPr/>
+      </w:r>
+    </w:p>
+    <w:p>
+      <w:pPr>
+        <w:pStyle w:val="Normal"/>
+        <w:bidi w:val="0"/>
+        <w:jc w:val="left"/>
+        <w:rPr/>
+      </w:pPr>
+      <w:r>
+        <w:rPr/>
+      </w:r>
+    </w:p>
+    <w:p>
+      <w:pPr>
+        <w:pStyle w:val="Normal"/>
+        <w:bidi w:val="0"/>
+        <w:jc w:val="left"/>
+        <w:rPr/>
+      </w:pPr>
+      <w:r>
+        <w:rPr/>
+      </w:r>
+    </w:p>
+    <w:p>
+      <w:pPr>
+        <w:pStyle w:val="Normal"/>
+        <w:bidi w:val="0"/>
+        <w:jc w:val="left"/>
+        <w:rPr/>
+      </w:pPr>
+      <w:r>
+        <w:rPr/>
+      </w:r>
+    </w:p>
+    <w:p>
+      <w:pPr>
+        <w:pStyle w:val="Normal"/>
+        <w:bidi w:val="0"/>
+        <w:jc w:val="left"/>
+        <w:rPr/>
+      </w:pPr>
+      <w:r>
+        <w:rPr/>
+        <w:t>=== Nouns, Feminine ===</w:t>
+      </w:r>
+    </w:p>
+    <w:p>
+      <w:pPr>
+        <w:pStyle w:val="Normal"/>
+        <w:bidi w:val="0"/>
+        <w:jc w:val="left"/>
+        <w:rPr/>
+      </w:pPr>
+      <w:r>
+        <w:rPr/>
+      </w:r>
+    </w:p>
+    <w:p>
+      <w:pPr>
+        <w:pStyle w:val="Normal"/>
+        <w:bidi w:val="0"/>
+        <w:jc w:val="left"/>
+        <w:rPr/>
+      </w:pPr>
+      <w:r>
+        <w:rPr/>
+        <w:t>--- Noun Feminine in -ά, -ές χαρά ---</w:t>
+      </w:r>
+    </w:p>
+    <w:p>
+      <w:pPr>
+        <w:pStyle w:val="Normal"/>
+        <w:bidi w:val="0"/>
+        <w:jc w:val="left"/>
+        <w:rPr/>
+      </w:pPr>
+      <w:r>
+        <w:rPr/>
+        <w:t>--- Noun Feminine in -ή, -ές φωνή ---</w:t>
+      </w:r>
+    </w:p>
+    <w:p>
+      <w:pPr>
+        <w:pStyle w:val="Normal"/>
+        <w:bidi w:val="0"/>
+        <w:jc w:val="left"/>
+        <w:rPr/>
+      </w:pPr>
+      <w:r>
+        <w:rPr/>
+        <w:t>--- Noun Feminine in -ος, -οι οδός ---</w:t>
+      </w:r>
+    </w:p>
+    <w:p>
+      <w:pPr>
+        <w:pStyle w:val="Normal"/>
+        <w:bidi w:val="0"/>
+        <w:jc w:val="left"/>
+        <w:rPr/>
+      </w:pPr>
+      <w:r>
+        <w:rPr/>
+        <w:t>--- Noun Feminine in -ά, -άδες μαμά ---</w:t>
+      </w:r>
+    </w:p>
+    <w:p>
+      <w:pPr>
+        <w:pStyle w:val="Normal"/>
+        <w:bidi w:val="0"/>
+        <w:jc w:val="left"/>
+        <w:rPr/>
+      </w:pPr>
+      <w:r>
+        <w:rPr/>
+        <w:t>--- Noun Feminine in -ού, -ούδες αλεπού ---</w:t>
+      </w:r>
+    </w:p>
+    <w:p>
+      <w:pPr>
+        <w:pStyle w:val="Normal"/>
+        <w:bidi w:val="0"/>
+        <w:jc w:val="left"/>
+        <w:rPr/>
+      </w:pPr>
+      <w:r>
+        <w:rPr/>
+        <w:t>--- Noun Feminine in -η, -εις πόλη ---</w:t>
+      </w:r>
+    </w:p>
+    <w:p>
+      <w:pPr>
+        <w:pStyle w:val="Normal"/>
+        <w:bidi w:val="0"/>
+        <w:jc w:val="left"/>
+        <w:rPr/>
+      </w:pPr>
+      <w:r>
+        <w:rPr/>
+        <w:t>--- Noun Feminine in -ώ (singular only) πειθώ ---</w:t>
+      </w:r>
+    </w:p>
+    <w:p>
+      <w:pPr>
+        <w:pStyle w:val="Normal"/>
+        <w:bidi w:val="0"/>
+        <w:jc w:val="left"/>
+        <w:rPr/>
+      </w:pPr>
+      <w:r>
+        <w:rPr/>
+        <w:t>--- Noun Feminine in -ω (singular only) Μάρω ---</w:t>
+      </w:r>
+    </w:p>
+    <w:p>
+      <w:pPr>
+        <w:pStyle w:val="Normal"/>
+        <w:bidi w:val="0"/>
+        <w:jc w:val="left"/>
+        <w:rPr/>
+      </w:pPr>
+      <w:r>
+        <w:rPr/>
+      </w:r>
+    </w:p>
+    <w:p>
+      <w:pPr>
+        <w:pStyle w:val="Normal"/>
+        <w:bidi w:val="0"/>
+        <w:jc w:val="left"/>
+        <w:rPr/>
+      </w:pPr>
+      <w:r>
+        <w:rPr/>
+        <w:t>--- Noun Feminine -ά, -ές ---</w:t>
       </w:r>
     </w:p>
     <w:p>
@@ -459,7 +773,7 @@
       </w:pPr>
       <w:r>
         <w:rPr/>
-        <w:t>--- 1-st Group Feminine -ή, -ές ---</w:t>
+        <w:t>--- Noun Feminine -ή, -ές ---</w:t>
       </w:r>
     </w:p>
     <w:p>
@@ -506,7 +820,7 @@
       </w:pPr>
       <w:r>
         <w:rPr/>
-        <w:t>--- 2-nd Group Feminine -ος, -οι ---</w:t>
+        <w:t>--- Noun Feminine -ός, -οί ---</w:t>
       </w:r>
     </w:p>
     <w:p>
@@ -553,7 +867,7 @@
       </w:pPr>
       <w:r>
         <w:rPr/>
-        <w:t>--- 3-rd Group Feminine -ά, -άδες ---</w:t>
+        <w:t>--- Noun Feminine -ά, -άδες ---</w:t>
       </w:r>
     </w:p>
     <w:p>
@@ -600,7 +914,7 @@
       </w:pPr>
       <w:r>
         <w:rPr/>
-        <w:t>--- 3-rd Group Feminine -ού, -ούδες ---</w:t>
+        <w:t>--- Noun Feminine -ού, -ούδες ---</w:t>
       </w:r>
     </w:p>
     <w:p>
@@ -647,7 +961,7 @@
       </w:pPr>
       <w:r>
         <w:rPr/>
-        <w:t>--- 3-rd Group Feminine -η, -εις ---</w:t>
+        <w:t>--- Noun Feminine -η, -εις ---</w:t>
       </w:r>
     </w:p>
     <w:p>
@@ -694,7 +1008,7 @@
       </w:pPr>
       <w:r>
         <w:rPr/>
-        <w:t>--- 3-rd Group Feminine -ω (singular only) ---</w:t>
+        <w:t>--- Noun Feminine -ώ (singular only) ---</w:t>
       </w:r>
     </w:p>
     <w:p>
@@ -718,6 +1032,29 @@
       </w:pPr>
       <w:r>
         <w:rPr/>
+      </w:r>
+    </w:p>
+    <w:p>
+      <w:pPr>
+        <w:pStyle w:val="Normal"/>
+        <w:bidi w:val="0"/>
+        <w:jc w:val="left"/>
+        <w:rPr/>
+      </w:pPr>
+      <w:r>
+        <w:rPr/>
+        <w:t>--- Noun Feminine in -ω (singular only) ---</w:t>
+      </w:r>
+    </w:p>
+    <w:p>
+      <w:pPr>
+        <w:pStyle w:val="Normal"/>
+        <w:bidi w:val="0"/>
+        <w:jc w:val="left"/>
+        <w:rPr/>
+      </w:pPr>
+      <w:r>
+        <w:rPr/>
         <w:t>Maro: Μάρω Μάρως Μάρω Μάρω</w:t>
       </w:r>
     </w:p>
@@ -741,7 +1078,272 @@
       </w:pPr>
       <w:r>
         <w:rPr/>
-        <w:t>--- 2-nd Group Neuter -ο, -ι ---</w:t>
+      </w:r>
+    </w:p>
+    <w:p>
+      <w:pPr>
+        <w:pStyle w:val="Normal"/>
+        <w:bidi w:val="0"/>
+        <w:jc w:val="left"/>
+        <w:rPr/>
+      </w:pPr>
+      <w:r>
+        <w:rPr/>
+      </w:r>
+    </w:p>
+    <w:p>
+      <w:pPr>
+        <w:pStyle w:val="Normal"/>
+        <w:bidi w:val="0"/>
+        <w:jc w:val="left"/>
+        <w:rPr/>
+      </w:pPr>
+      <w:r>
+        <w:rPr/>
+      </w:r>
+    </w:p>
+    <w:p>
+      <w:pPr>
+        <w:pStyle w:val="Normal"/>
+        <w:bidi w:val="0"/>
+        <w:jc w:val="left"/>
+        <w:rPr/>
+      </w:pPr>
+      <w:r>
+        <w:rPr/>
+      </w:r>
+    </w:p>
+    <w:p>
+      <w:pPr>
+        <w:pStyle w:val="Normal"/>
+        <w:bidi w:val="0"/>
+        <w:jc w:val="left"/>
+        <w:rPr/>
+      </w:pPr>
+      <w:r>
+        <w:rPr/>
+      </w:r>
+    </w:p>
+    <w:p>
+      <w:pPr>
+        <w:pStyle w:val="Normal"/>
+        <w:bidi w:val="0"/>
+        <w:jc w:val="left"/>
+        <w:rPr/>
+      </w:pPr>
+      <w:r>
+        <w:rPr/>
+      </w:r>
+    </w:p>
+    <w:p>
+      <w:pPr>
+        <w:pStyle w:val="Normal"/>
+        <w:bidi w:val="0"/>
+        <w:jc w:val="left"/>
+        <w:rPr/>
+      </w:pPr>
+      <w:r>
+        <w:rPr/>
+      </w:r>
+    </w:p>
+    <w:p>
+      <w:pPr>
+        <w:pStyle w:val="Normal"/>
+        <w:bidi w:val="0"/>
+        <w:jc w:val="left"/>
+        <w:rPr/>
+      </w:pPr>
+      <w:r>
+        <w:rPr/>
+      </w:r>
+    </w:p>
+    <w:p>
+      <w:pPr>
+        <w:pStyle w:val="Normal"/>
+        <w:bidi w:val="0"/>
+        <w:jc w:val="left"/>
+        <w:rPr/>
+      </w:pPr>
+      <w:r>
+        <w:rPr/>
+      </w:r>
+    </w:p>
+    <w:p>
+      <w:pPr>
+        <w:pStyle w:val="Normal"/>
+        <w:bidi w:val="0"/>
+        <w:jc w:val="left"/>
+        <w:rPr/>
+      </w:pPr>
+      <w:r>
+        <w:rPr/>
+        <w:t>=== Nouns, Neuter ===</w:t>
+      </w:r>
+    </w:p>
+    <w:p>
+      <w:pPr>
+        <w:pStyle w:val="Normal"/>
+        <w:bidi w:val="0"/>
+        <w:jc w:val="left"/>
+        <w:rPr/>
+      </w:pPr>
+      <w:r>
+        <w:rPr/>
+      </w:r>
+    </w:p>
+    <w:p>
+      <w:pPr>
+        <w:pStyle w:val="Normal"/>
+        <w:bidi w:val="0"/>
+        <w:jc w:val="left"/>
+        <w:rPr/>
+      </w:pPr>
+      <w:r>
+        <w:rPr/>
+        <w:t>--- Noun Neuter in -ο, -α βιβλίο ---</w:t>
+      </w:r>
+    </w:p>
+    <w:p>
+      <w:pPr>
+        <w:pStyle w:val="Normal"/>
+        <w:bidi w:val="0"/>
+        <w:jc w:val="left"/>
+        <w:rPr/>
+      </w:pPr>
+      <w:r>
+        <w:rPr/>
+        <w:t>--- Noun Neuter in -ι, -α σπίτι ---</w:t>
+      </w:r>
+    </w:p>
+    <w:p>
+      <w:pPr>
+        <w:pStyle w:val="Normal"/>
+        <w:bidi w:val="0"/>
+        <w:jc w:val="left"/>
+        <w:rPr/>
+      </w:pPr>
+      <w:r>
+        <w:rPr/>
+        <w:t>--- Noun Neuter in -ος, -η έθνος ---</w:t>
+      </w:r>
+    </w:p>
+    <w:p>
+      <w:pPr>
+        <w:pStyle w:val="Normal"/>
+        <w:bidi w:val="0"/>
+        <w:jc w:val="left"/>
+        <w:rPr/>
+      </w:pPr>
+      <w:r>
+        <w:rPr/>
+        <w:t>--- Noun Neuter in -μα, -ματα γράμμα ---</w:t>
+      </w:r>
+    </w:p>
+    <w:p>
+      <w:pPr>
+        <w:pStyle w:val="Normal"/>
+        <w:bidi w:val="0"/>
+        <w:jc w:val="left"/>
+        <w:rPr/>
+      </w:pPr>
+      <w:r>
+        <w:rPr/>
+        <w:t>--- Noun Neuter in -ιμο, -ίματα γράψιμο ---</w:t>
+      </w:r>
+    </w:p>
+    <w:p>
+      <w:pPr>
+        <w:pStyle w:val="Normal"/>
+        <w:bidi w:val="0"/>
+        <w:jc w:val="left"/>
+        <w:rPr/>
+      </w:pPr>
+      <w:r>
+        <w:rPr/>
+        <w:t>--- Noun Neuter in -ας, -ατα κρέας ---</w:t>
+      </w:r>
+    </w:p>
+    <w:p>
+      <w:pPr>
+        <w:pStyle w:val="Normal"/>
+        <w:bidi w:val="0"/>
+        <w:jc w:val="left"/>
+        <w:rPr/>
+      </w:pPr>
+      <w:r>
+        <w:rPr/>
+        <w:t>--- Noun Neuter in -ός, -ότα γεγονός ---</w:t>
+      </w:r>
+    </w:p>
+    <w:p>
+      <w:pPr>
+        <w:pStyle w:val="Normal"/>
+        <w:bidi w:val="0"/>
+        <w:jc w:val="left"/>
+        <w:rPr/>
+      </w:pPr>
+      <w:r>
+        <w:rPr/>
+        <w:t>--- Noun Neuter in -ώς, -ώτα φως ---</w:t>
+      </w:r>
+    </w:p>
+    <w:p>
+      <w:pPr>
+        <w:pStyle w:val="Normal"/>
+        <w:bidi w:val="0"/>
+        <w:jc w:val="left"/>
+        <w:rPr/>
+      </w:pPr>
+      <w:r>
+        <w:rPr/>
+        <w:t>--- Noun Neuter in -αν, -αντα σύμπαν  ---</w:t>
+      </w:r>
+    </w:p>
+    <w:p>
+      <w:pPr>
+        <w:pStyle w:val="Normal"/>
+        <w:bidi w:val="0"/>
+        <w:jc w:val="left"/>
+        <w:rPr/>
+      </w:pPr>
+      <w:r>
+        <w:rPr/>
+        <w:t>--- Noun Neuter in -ον, -οντα συμφέρον ---</w:t>
+      </w:r>
+    </w:p>
+    <w:p>
+      <w:pPr>
+        <w:pStyle w:val="Normal"/>
+        <w:bidi w:val="0"/>
+        <w:jc w:val="left"/>
+        <w:rPr/>
+      </w:pPr>
+      <w:r>
+        <w:rPr/>
+        <w:t>--- Noun Neuter in -εν, -εντα φωνήεν ---</w:t>
+      </w:r>
+    </w:p>
+    <w:p>
+      <w:pPr>
+        <w:pStyle w:val="Normal"/>
+        <w:bidi w:val="0"/>
+        <w:jc w:val="left"/>
+        <w:rPr/>
+      </w:pPr>
+      <w:r>
+        <w:rPr/>
+      </w:r>
+    </w:p>
+    <w:p>
+      <w:pPr>
+        <w:pStyle w:val="Normal"/>
+        <w:bidi w:val="0"/>
+        <w:jc w:val="left"/>
+        <w:rPr/>
+      </w:pPr>
+      <w:r>
+        <w:rPr/>
+        <w:t>--- Noun Neuter -ο, -ι ---</w:t>
       </w:r>
     </w:p>
     <w:p>
@@ -788,7 +1390,7 @@
       </w:pPr>
       <w:r>
         <w:rPr/>
-        <w:t>--- 2-nd Group Neuter -ι, -α ---</w:t>
+        <w:t>--- Noun Neuter -ι, -α ---</w:t>
       </w:r>
     </w:p>
     <w:p>
@@ -835,7 +1437,7 @@
       </w:pPr>
       <w:r>
         <w:rPr/>
-        <w:t>--- 3-rd Group Neuter -ος, -η ---</w:t>
+        <w:t>--- Noun Neuter -ος, -η ---</w:t>
       </w:r>
     </w:p>
     <w:p>
@@ -882,7 +1484,7 @@
       </w:pPr>
       <w:r>
         <w:rPr/>
-        <w:t>--- 3-rd Group Neuter -μα, -ματα ---</w:t>
+        <w:t>--- Noun Neuter -μα, -ματα ---</w:t>
       </w:r>
     </w:p>
     <w:p>
@@ -929,7 +1531,7 @@
       </w:pPr>
       <w:r>
         <w:rPr/>
-        <w:t>--- 3-rd Group Neuter -ιμο, -ίματα ---</w:t>
+        <w:t>--- Noun Neuter -ιμο, -ίματα ---</w:t>
       </w:r>
     </w:p>
     <w:p>
@@ -976,7 +1578,7 @@
       </w:pPr>
       <w:r>
         <w:rPr/>
-        <w:t>--- 3-rd Group Neuter -ας, -ατα ---</w:t>
+        <w:t>--- Noun Neuter -ας, -ατα ---</w:t>
       </w:r>
     </w:p>
     <w:p>
@@ -1023,7 +1625,7 @@
       </w:pPr>
       <w:r>
         <w:rPr/>
-        <w:t>--- 3-rd Group Neuter -ός, -ότα ---</w:t>
+        <w:t>--- Noun Neuter -ός, -ότα ---</w:t>
       </w:r>
     </w:p>
     <w:p>
@@ -1070,7 +1672,7 @@
       </w:pPr>
       <w:r>
         <w:rPr/>
-        <w:t>--- 3-rd Group Neuter -ώς, -ώτα ---</w:t>
+        <w:t>--- Noun Neuter -ώς, -ώτα ---</w:t>
       </w:r>
     </w:p>
     <w:p>
@@ -1117,73 +1719,681 @@
       </w:pPr>
       <w:r>
         <w:rPr/>
-      </w:r>
-    </w:p>
-    <w:p>
-      <w:pPr>
-        <w:pStyle w:val="Normal"/>
-        <w:bidi w:val="0"/>
-        <w:jc w:val="left"/>
-        <w:rPr/>
-      </w:pPr>
-      <w:r>
-        <w:rPr/>
-      </w:r>
-    </w:p>
-    <w:p>
-      <w:pPr>
-        <w:pStyle w:val="Normal"/>
-        <w:bidi w:val="0"/>
-        <w:jc w:val="left"/>
-        <w:rPr/>
-      </w:pPr>
-      <w:r>
-        <w:rPr/>
-      </w:r>
-    </w:p>
-    <w:p>
-      <w:pPr>
-        <w:pStyle w:val="Normal"/>
-        <w:bidi w:val="0"/>
-        <w:jc w:val="left"/>
-        <w:rPr/>
-      </w:pPr>
-      <w:r>
-        <w:rPr/>
-      </w:r>
-    </w:p>
-    <w:p>
-      <w:pPr>
-        <w:pStyle w:val="Normal"/>
-        <w:bidi w:val="0"/>
-        <w:jc w:val="left"/>
-        <w:rPr/>
-      </w:pPr>
-      <w:r>
-        <w:rPr/>
-      </w:r>
-    </w:p>
-    <w:p>
-      <w:pPr>
-        <w:pStyle w:val="Normal"/>
-        <w:bidi w:val="0"/>
-        <w:jc w:val="left"/>
-        <w:rPr/>
-      </w:pPr>
-      <w:r>
-        <w:rPr/>
-      </w:r>
-    </w:p>
-    <w:p>
-      <w:pPr>
-        <w:pStyle w:val="Normal"/>
-        <w:bidi w:val="0"/>
-        <w:jc w:val="left"/>
-        <w:rPr/>
-      </w:pPr>
-      <w:r>
-        <w:rPr/>
-        <w:t>=== Adjectives ===</w:t>
+        <w:t>--- Noun Neuter in -αν, -αντα ---</w:t>
+      </w:r>
+    </w:p>
+    <w:p>
+      <w:pPr>
+        <w:pStyle w:val="Normal"/>
+        <w:bidi w:val="0"/>
+        <w:jc w:val="left"/>
+        <w:rPr/>
+      </w:pPr>
+      <w:r>
+        <w:rPr/>
+        <w:t>Universe: σύμπαν σύμπαντος σύμπαν σύμπαν</w:t>
+      </w:r>
+    </w:p>
+    <w:p>
+      <w:pPr>
+        <w:pStyle w:val="Normal"/>
+        <w:bidi w:val="0"/>
+        <w:jc w:val="left"/>
+        <w:rPr/>
+      </w:pPr>
+      <w:r>
+        <w:rPr/>
+        <w:t>Universes: σύμπαντα συμπάντων σύμπαντα σύμπαντα</w:t>
+      </w:r>
+    </w:p>
+    <w:p>
+      <w:pPr>
+        <w:pStyle w:val="Normal"/>
+        <w:bidi w:val="0"/>
+        <w:jc w:val="left"/>
+        <w:rPr/>
+      </w:pPr>
+      <w:r>
+        <w:rPr/>
+      </w:r>
+    </w:p>
+    <w:p>
+      <w:pPr>
+        <w:pStyle w:val="Normal"/>
+        <w:bidi w:val="0"/>
+        <w:jc w:val="left"/>
+        <w:rPr/>
+      </w:pPr>
+      <w:r>
+        <w:rPr/>
+        <w:t>--- Noun Neuter in -ον, -οντα ---</w:t>
+      </w:r>
+    </w:p>
+    <w:p>
+      <w:pPr>
+        <w:pStyle w:val="Normal"/>
+        <w:bidi w:val="0"/>
+        <w:jc w:val="left"/>
+        <w:rPr/>
+      </w:pPr>
+      <w:r>
+        <w:rPr/>
+        <w:t>Interest: συμφέρον συμφέροντος συμφέρον συμφέρον</w:t>
+      </w:r>
+    </w:p>
+    <w:p>
+      <w:pPr>
+        <w:pStyle w:val="Normal"/>
+        <w:bidi w:val="0"/>
+        <w:jc w:val="left"/>
+        <w:rPr/>
+      </w:pPr>
+      <w:r>
+        <w:rPr/>
+        <w:t>Interests: συμφέροντα συμφερόντων συμφέροντα συμφέροντα</w:t>
+      </w:r>
+    </w:p>
+    <w:p>
+      <w:pPr>
+        <w:pStyle w:val="Normal"/>
+        <w:bidi w:val="0"/>
+        <w:jc w:val="left"/>
+        <w:rPr/>
+      </w:pPr>
+      <w:r>
+        <w:rPr/>
+      </w:r>
+    </w:p>
+    <w:p>
+      <w:pPr>
+        <w:pStyle w:val="Normal"/>
+        <w:bidi w:val="0"/>
+        <w:jc w:val="left"/>
+        <w:rPr/>
+      </w:pPr>
+      <w:r>
+        <w:rPr/>
+        <w:t>--- Noun Neuter in -εν, -εντα ---</w:t>
+      </w:r>
+    </w:p>
+    <w:p>
+      <w:pPr>
+        <w:pStyle w:val="Normal"/>
+        <w:bidi w:val="0"/>
+        <w:jc w:val="left"/>
+        <w:rPr/>
+      </w:pPr>
+      <w:r>
+        <w:rPr/>
+        <w:t>Vowel: φωνήεν φωνήεντος φωνήεν φωνήεν</w:t>
+      </w:r>
+    </w:p>
+    <w:p>
+      <w:pPr>
+        <w:pStyle w:val="Normal"/>
+        <w:bidi w:val="0"/>
+        <w:jc w:val="left"/>
+        <w:rPr/>
+      </w:pPr>
+      <w:r>
+        <w:rPr/>
+        <w:t>Vowels: φωνήεντα φωνηέντων φωνήεντα φωνήεντα</w:t>
+      </w:r>
+    </w:p>
+    <w:p>
+      <w:pPr>
+        <w:pStyle w:val="Normal"/>
+        <w:bidi w:val="0"/>
+        <w:jc w:val="left"/>
+        <w:rPr/>
+      </w:pPr>
+      <w:r>
+        <w:rPr/>
+      </w:r>
+    </w:p>
+    <w:p>
+      <w:pPr>
+        <w:pStyle w:val="Normal"/>
+        <w:bidi w:val="0"/>
+        <w:jc w:val="left"/>
+        <w:rPr/>
+      </w:pPr>
+      <w:r>
+        <w:rPr/>
+      </w:r>
+    </w:p>
+    <w:p>
+      <w:pPr>
+        <w:pStyle w:val="Normal"/>
+        <w:bidi w:val="0"/>
+        <w:jc w:val="left"/>
+        <w:rPr/>
+      </w:pPr>
+      <w:r>
+        <w:rPr/>
+      </w:r>
+    </w:p>
+    <w:p>
+      <w:pPr>
+        <w:pStyle w:val="Normal"/>
+        <w:bidi w:val="0"/>
+        <w:jc w:val="left"/>
+        <w:rPr/>
+      </w:pPr>
+      <w:r>
+        <w:rPr/>
+      </w:r>
+    </w:p>
+    <w:p>
+      <w:pPr>
+        <w:pStyle w:val="Normal"/>
+        <w:bidi w:val="0"/>
+        <w:jc w:val="left"/>
+        <w:rPr/>
+      </w:pPr>
+      <w:r>
+        <w:rPr/>
+      </w:r>
+    </w:p>
+    <w:p>
+      <w:pPr>
+        <w:pStyle w:val="Normal"/>
+        <w:bidi w:val="0"/>
+        <w:jc w:val="left"/>
+        <w:rPr/>
+      </w:pPr>
+      <w:r>
+        <w:rPr/>
+      </w:r>
+    </w:p>
+    <w:p>
+      <w:pPr>
+        <w:pStyle w:val="Normal"/>
+        <w:bidi w:val="0"/>
+        <w:jc w:val="left"/>
+        <w:rPr/>
+      </w:pPr>
+      <w:r>
+        <w:rPr/>
+      </w:r>
+    </w:p>
+    <w:p>
+      <w:pPr>
+        <w:pStyle w:val="Normal"/>
+        <w:bidi w:val="0"/>
+        <w:jc w:val="left"/>
+        <w:rPr/>
+      </w:pPr>
+      <w:r>
+        <w:rPr/>
+      </w:r>
+    </w:p>
+    <w:p>
+      <w:pPr>
+        <w:pStyle w:val="Normal"/>
+        <w:bidi w:val="0"/>
+        <w:jc w:val="left"/>
+        <w:rPr/>
+      </w:pPr>
+      <w:r>
+        <w:rPr/>
+      </w:r>
+    </w:p>
+    <w:p>
+      <w:pPr>
+        <w:pStyle w:val="Normal"/>
+        <w:bidi w:val="0"/>
+        <w:jc w:val="left"/>
+        <w:rPr/>
+      </w:pPr>
+      <w:r>
+        <w:rPr/>
+      </w:r>
+    </w:p>
+    <w:p>
+      <w:pPr>
+        <w:pStyle w:val="Normal"/>
+        <w:bidi w:val="0"/>
+        <w:jc w:val="left"/>
+        <w:rPr/>
+      </w:pPr>
+      <w:r>
+        <w:rPr/>
+      </w:r>
+    </w:p>
+    <w:p>
+      <w:pPr>
+        <w:pStyle w:val="Normal"/>
+        <w:bidi w:val="0"/>
+        <w:jc w:val="left"/>
+        <w:rPr/>
+      </w:pPr>
+      <w:r>
+        <w:rPr/>
+      </w:r>
+    </w:p>
+    <w:p>
+      <w:pPr>
+        <w:pStyle w:val="Normal"/>
+        <w:bidi w:val="0"/>
+        <w:jc w:val="left"/>
+        <w:rPr/>
+      </w:pPr>
+      <w:r>
+        <w:rPr/>
+      </w:r>
+    </w:p>
+    <w:p>
+      <w:pPr>
+        <w:pStyle w:val="Normal"/>
+        <w:bidi w:val="0"/>
+        <w:jc w:val="left"/>
+        <w:rPr/>
+      </w:pPr>
+      <w:r>
+        <w:rPr/>
+      </w:r>
+    </w:p>
+    <w:p>
+      <w:pPr>
+        <w:pStyle w:val="Normal"/>
+        <w:bidi w:val="0"/>
+        <w:jc w:val="left"/>
+        <w:rPr/>
+      </w:pPr>
+      <w:r>
+        <w:rPr/>
+      </w:r>
+    </w:p>
+    <w:p>
+      <w:pPr>
+        <w:pStyle w:val="Normal"/>
+        <w:bidi w:val="0"/>
+        <w:jc w:val="left"/>
+        <w:rPr/>
+      </w:pPr>
+      <w:r>
+        <w:rPr/>
+      </w:r>
+    </w:p>
+    <w:p>
+      <w:pPr>
+        <w:pStyle w:val="Normal"/>
+        <w:bidi w:val="0"/>
+        <w:jc w:val="left"/>
+        <w:rPr/>
+      </w:pPr>
+      <w:r>
+        <w:rPr/>
+      </w:r>
+    </w:p>
+    <w:p>
+      <w:pPr>
+        <w:pStyle w:val="Normal"/>
+        <w:bidi w:val="0"/>
+        <w:jc w:val="left"/>
+        <w:rPr/>
+      </w:pPr>
+      <w:r>
+        <w:rPr/>
+      </w:r>
+    </w:p>
+    <w:p>
+      <w:pPr>
+        <w:pStyle w:val="Normal"/>
+        <w:bidi w:val="0"/>
+        <w:jc w:val="left"/>
+        <w:rPr/>
+      </w:pPr>
+      <w:r>
+        <w:rPr/>
+      </w:r>
+    </w:p>
+    <w:p>
+      <w:pPr>
+        <w:pStyle w:val="Normal"/>
+        <w:bidi w:val="0"/>
+        <w:jc w:val="left"/>
+        <w:rPr/>
+      </w:pPr>
+      <w:r>
+        <w:rPr/>
+      </w:r>
+    </w:p>
+    <w:p>
+      <w:pPr>
+        <w:pStyle w:val="Normal"/>
+        <w:bidi w:val="0"/>
+        <w:jc w:val="left"/>
+        <w:rPr/>
+      </w:pPr>
+      <w:r>
+        <w:rPr/>
+      </w:r>
+    </w:p>
+    <w:p>
+      <w:pPr>
+        <w:pStyle w:val="Normal"/>
+        <w:bidi w:val="0"/>
+        <w:jc w:val="left"/>
+        <w:rPr/>
+      </w:pPr>
+      <w:r>
+        <w:rPr/>
+      </w:r>
+    </w:p>
+    <w:p>
+      <w:pPr>
+        <w:pStyle w:val="Normal"/>
+        <w:bidi w:val="0"/>
+        <w:jc w:val="left"/>
+        <w:rPr/>
+      </w:pPr>
+      <w:r>
+        <w:rPr/>
+      </w:r>
+    </w:p>
+    <w:p>
+      <w:pPr>
+        <w:pStyle w:val="Normal"/>
+        <w:bidi w:val="0"/>
+        <w:jc w:val="left"/>
+        <w:rPr/>
+      </w:pPr>
+      <w:r>
+        <w:rPr/>
+      </w:r>
+    </w:p>
+    <w:p>
+      <w:pPr>
+        <w:pStyle w:val="Normal"/>
+        <w:bidi w:val="0"/>
+        <w:jc w:val="left"/>
+        <w:rPr/>
+      </w:pPr>
+      <w:r>
+        <w:rPr/>
+      </w:r>
+    </w:p>
+    <w:p>
+      <w:pPr>
+        <w:pStyle w:val="Normal"/>
+        <w:bidi w:val="0"/>
+        <w:jc w:val="left"/>
+        <w:rPr/>
+      </w:pPr>
+      <w:r>
+        <w:rPr/>
+      </w:r>
+    </w:p>
+    <w:p>
+      <w:pPr>
+        <w:pStyle w:val="Normal"/>
+        <w:bidi w:val="0"/>
+        <w:jc w:val="left"/>
+        <w:rPr/>
+      </w:pPr>
+      <w:r>
+        <w:rPr/>
+      </w:r>
+    </w:p>
+    <w:p>
+      <w:pPr>
+        <w:pStyle w:val="Normal"/>
+        <w:bidi w:val="0"/>
+        <w:jc w:val="left"/>
+        <w:rPr/>
+      </w:pPr>
+      <w:r>
+        <w:rPr/>
+      </w:r>
+    </w:p>
+    <w:p>
+      <w:pPr>
+        <w:pStyle w:val="Normal"/>
+        <w:bidi w:val="0"/>
+        <w:jc w:val="left"/>
+        <w:rPr/>
+      </w:pPr>
+      <w:r>
+        <w:rPr/>
+      </w:r>
+    </w:p>
+    <w:p>
+      <w:pPr>
+        <w:pStyle w:val="Normal"/>
+        <w:bidi w:val="0"/>
+        <w:jc w:val="left"/>
+        <w:rPr/>
+      </w:pPr>
+      <w:r>
+        <w:rPr/>
+      </w:r>
+    </w:p>
+    <w:p>
+      <w:pPr>
+        <w:pStyle w:val="Normal"/>
+        <w:bidi w:val="0"/>
+        <w:jc w:val="left"/>
+        <w:rPr/>
+      </w:pPr>
+      <w:r>
+        <w:rPr/>
+      </w:r>
+    </w:p>
+    <w:p>
+      <w:pPr>
+        <w:pStyle w:val="Normal"/>
+        <w:bidi w:val="0"/>
+        <w:jc w:val="left"/>
+        <w:rPr/>
+      </w:pPr>
+      <w:r>
+        <w:rPr/>
+      </w:r>
+    </w:p>
+    <w:p>
+      <w:pPr>
+        <w:pStyle w:val="Normal"/>
+        <w:bidi w:val="0"/>
+        <w:jc w:val="left"/>
+        <w:rPr/>
+      </w:pPr>
+      <w:r>
+        <w:rPr/>
+      </w:r>
+    </w:p>
+    <w:p>
+      <w:pPr>
+        <w:pStyle w:val="Normal"/>
+        <w:bidi w:val="0"/>
+        <w:jc w:val="left"/>
+        <w:rPr/>
+      </w:pPr>
+      <w:r>
+        <w:rPr/>
+      </w:r>
+    </w:p>
+    <w:p>
+      <w:pPr>
+        <w:pStyle w:val="Normal"/>
+        <w:bidi w:val="0"/>
+        <w:jc w:val="left"/>
+        <w:rPr/>
+      </w:pPr>
+      <w:r>
+        <w:rPr/>
+      </w:r>
+    </w:p>
+    <w:p>
+      <w:pPr>
+        <w:pStyle w:val="Normal"/>
+        <w:bidi w:val="0"/>
+        <w:jc w:val="left"/>
+        <w:rPr/>
+      </w:pPr>
+      <w:r>
+        <w:rPr/>
+      </w:r>
+    </w:p>
+    <w:p>
+      <w:pPr>
+        <w:pStyle w:val="Normal"/>
+        <w:bidi w:val="0"/>
+        <w:jc w:val="left"/>
+        <w:rPr/>
+      </w:pPr>
+      <w:r>
+        <w:rPr/>
+      </w:r>
+    </w:p>
+    <w:p>
+      <w:pPr>
+        <w:pStyle w:val="Normal"/>
+        <w:bidi w:val="0"/>
+        <w:jc w:val="left"/>
+        <w:rPr/>
+      </w:pPr>
+      <w:r>
+        <w:rPr/>
+      </w:r>
+    </w:p>
+    <w:p>
+      <w:pPr>
+        <w:pStyle w:val="Normal"/>
+        <w:bidi w:val="0"/>
+        <w:jc w:val="left"/>
+        <w:rPr/>
+      </w:pPr>
+      <w:r>
+        <w:rPr/>
+      </w:r>
+    </w:p>
+    <w:p>
+      <w:pPr>
+        <w:pStyle w:val="Normal"/>
+        <w:bidi w:val="0"/>
+        <w:jc w:val="left"/>
+        <w:rPr/>
+      </w:pPr>
+      <w:r>
+        <w:rPr/>
+      </w:r>
+    </w:p>
+    <w:p>
+      <w:pPr>
+        <w:pStyle w:val="Normal"/>
+        <w:bidi w:val="0"/>
+        <w:jc w:val="left"/>
+        <w:rPr/>
+      </w:pPr>
+      <w:r>
+        <w:rPr/>
+      </w:r>
+    </w:p>
+    <w:p>
+      <w:pPr>
+        <w:pStyle w:val="Normal"/>
+        <w:bidi w:val="0"/>
+        <w:jc w:val="left"/>
+        <w:rPr/>
+      </w:pPr>
+      <w:r>
+        <w:rPr/>
+      </w:r>
+    </w:p>
+    <w:p>
+      <w:pPr>
+        <w:pStyle w:val="Normal"/>
+        <w:bidi w:val="0"/>
+        <w:jc w:val="left"/>
+        <w:rPr/>
+      </w:pPr>
+      <w:r>
+        <w:rPr/>
+      </w:r>
+    </w:p>
+    <w:p>
+      <w:pPr>
+        <w:pStyle w:val="Normal"/>
+        <w:bidi w:val="0"/>
+        <w:jc w:val="left"/>
+        <w:rPr/>
+      </w:pPr>
+      <w:r>
+        <w:rPr/>
+        <w:t>=== Adjectives, First Part ===</w:t>
+      </w:r>
+    </w:p>
+    <w:p>
+      <w:pPr>
+        <w:pStyle w:val="Normal"/>
+        <w:bidi w:val="0"/>
+        <w:jc w:val="left"/>
+        <w:rPr/>
+      </w:pPr>
+      <w:r>
+        <w:rPr/>
+      </w:r>
+    </w:p>
+    <w:p>
+      <w:pPr>
+        <w:pStyle w:val="Normal"/>
+        <w:bidi w:val="0"/>
+        <w:jc w:val="left"/>
+        <w:rPr/>
+      </w:pPr>
+      <w:r>
+        <w:rPr/>
+        <w:t>--- Adj. in -ός, -η, -ο καλός ---</w:t>
+      </w:r>
+    </w:p>
+    <w:p>
+      <w:pPr>
+        <w:pStyle w:val="Normal"/>
+        <w:bidi w:val="0"/>
+        <w:jc w:val="left"/>
+        <w:rPr/>
+      </w:pPr>
+      <w:r>
+        <w:rPr/>
+        <w:t>--- Adj. in -ος, -α, -ο νέος ---</w:t>
+      </w:r>
+    </w:p>
+    <w:p>
+      <w:pPr>
+        <w:pStyle w:val="Normal"/>
+        <w:bidi w:val="0"/>
+        <w:jc w:val="left"/>
+        <w:rPr/>
+      </w:pPr>
+      <w:r>
+        <w:rPr/>
+        <w:t>--- Adj. in -ός, -ιά, -ό κακός ---</w:t>
+      </w:r>
+    </w:p>
+    <w:p>
+      <w:pPr>
+        <w:pStyle w:val="Normal"/>
+        <w:bidi w:val="0"/>
+        <w:jc w:val="left"/>
+        <w:rPr/>
+      </w:pPr>
+      <w:r>
+        <w:rPr/>
+        <w:t>--- Adj. in -ύς, -ιά, -ύ πλατύς ---</w:t>
+      </w:r>
+    </w:p>
+    <w:p>
+      <w:pPr>
+        <w:pStyle w:val="Normal"/>
+        <w:bidi w:val="0"/>
+        <w:jc w:val="left"/>
+        <w:rPr/>
+      </w:pPr>
+      <w:r>
+        <w:rPr/>
+        <w:t>--- Adj. in -ύς, -εία, -ύ ταχύς ---</w:t>
       </w:r>
     </w:p>
     <w:p>
@@ -1681,6 +2891,145 @@
       </w:pPr>
       <w:r>
         <w:rPr/>
+      </w:r>
+    </w:p>
+    <w:p>
+      <w:pPr>
+        <w:pStyle w:val="Normal"/>
+        <w:bidi w:val="0"/>
+        <w:jc w:val="left"/>
+        <w:rPr/>
+      </w:pPr>
+      <w:r>
+        <w:rPr/>
+      </w:r>
+    </w:p>
+    <w:p>
+      <w:pPr>
+        <w:pStyle w:val="Normal"/>
+        <w:bidi w:val="0"/>
+        <w:jc w:val="left"/>
+        <w:rPr/>
+      </w:pPr>
+      <w:r>
+        <w:rPr/>
+      </w:r>
+    </w:p>
+    <w:p>
+      <w:pPr>
+        <w:pStyle w:val="Normal"/>
+        <w:bidi w:val="0"/>
+        <w:jc w:val="left"/>
+        <w:rPr/>
+      </w:pPr>
+      <w:r>
+        <w:rPr/>
+        <w:t>=== Adjectives, Second Part ===</w:t>
+      </w:r>
+    </w:p>
+    <w:p>
+      <w:pPr>
+        <w:pStyle w:val="Normal"/>
+        <w:bidi w:val="0"/>
+        <w:jc w:val="left"/>
+        <w:rPr/>
+      </w:pPr>
+      <w:r>
+        <w:rPr/>
+      </w:r>
+    </w:p>
+    <w:p>
+      <w:pPr>
+        <w:pStyle w:val="Normal"/>
+        <w:bidi w:val="0"/>
+        <w:jc w:val="left"/>
+        <w:rPr/>
+      </w:pPr>
+      <w:r>
+        <w:rPr/>
+        <w:t>--- Adj. in -ής, -ιά, -ί καφετής ---</w:t>
+      </w:r>
+    </w:p>
+    <w:p>
+      <w:pPr>
+        <w:pStyle w:val="Normal"/>
+        <w:bidi w:val="0"/>
+        <w:jc w:val="left"/>
+        <w:rPr/>
+      </w:pPr>
+      <w:r>
+        <w:rPr/>
+        <w:t>--- Adj. in -ης, -α, -ικο ζηλιάρης ---</w:t>
+      </w:r>
+    </w:p>
+    <w:p>
+      <w:pPr>
+        <w:pStyle w:val="Normal"/>
+        <w:bidi w:val="0"/>
+        <w:jc w:val="left"/>
+        <w:rPr/>
+      </w:pPr>
+      <w:r>
+        <w:rPr/>
+        <w:t>--- Adj. in -ων, -ουσα, -ον ενδιαφέρων ---</w:t>
+      </w:r>
+    </w:p>
+    <w:p>
+      <w:pPr>
+        <w:pStyle w:val="Normal"/>
+        <w:bidi w:val="0"/>
+        <w:jc w:val="left"/>
+        <w:rPr/>
+      </w:pPr>
+      <w:r>
+        <w:rPr/>
+        <w:t>--- Adj. in -ης, -ης, -ες διεθνής ---</w:t>
+      </w:r>
+    </w:p>
+    <w:p>
+      <w:pPr>
+        <w:pStyle w:val="Normal"/>
+        <w:bidi w:val="0"/>
+        <w:jc w:val="left"/>
+        <w:rPr/>
+      </w:pPr>
+      <w:r>
+        <w:rPr/>
+        <w:t>--- Adj. in -ύς, -ή, -ύ πολύς ---</w:t>
+      </w:r>
+    </w:p>
+    <w:p>
+      <w:pPr>
+        <w:pStyle w:val="Normal"/>
+        <w:bidi w:val="0"/>
+        <w:jc w:val="left"/>
+        <w:rPr/>
+      </w:pPr>
+      <w:r>
+        <w:rPr/>
+        <w:t>--- Adj. in -άς, -ού, -ικο φαγάς ---</w:t>
+      </w:r>
+    </w:p>
+    <w:p>
+      <w:pPr>
+        <w:pStyle w:val="Normal"/>
+        <w:bidi w:val="0"/>
+        <w:jc w:val="left"/>
+        <w:rPr/>
+      </w:pPr>
+      <w:r>
+        <w:rPr/>
+      </w:r>
+    </w:p>
+    <w:p>
+      <w:pPr>
+        <w:pStyle w:val="Normal"/>
+        <w:bidi w:val="0"/>
+        <w:jc w:val="left"/>
+        <w:rPr/>
+      </w:pPr>
+      <w:r>
+        <w:rPr/>
         <w:t>--- -ής, -ιά, -ί ---</w:t>
       </w:r>
     </w:p>
@@ -1693,7 +3042,7 @@
       </w:pPr>
       <w:r>
         <w:rPr/>
-        <w:t>Brownish (m. sg.): καφετής αφετή αφετή αφετή</w:t>
+        <w:t>Brownish (m. sg.): καφετής καφετή καφετή καφετή</w:t>
       </w:r>
     </w:p>
     <w:p>
@@ -2229,6 +3578,358 @@
       <w:r>
         <w:rPr/>
         <w:t>Glutton (n. pl.): φαγάδικα φαγάδικων φαγάδικα φαγάδικα</w:t>
+      </w:r>
+    </w:p>
+    <w:p>
+      <w:pPr>
+        <w:pStyle w:val="Normal"/>
+        <w:bidi w:val="0"/>
+        <w:jc w:val="left"/>
+        <w:rPr/>
+      </w:pPr>
+      <w:r>
+        <w:rPr/>
+      </w:r>
+    </w:p>
+    <w:p>
+      <w:pPr>
+        <w:pStyle w:val="Normal"/>
+        <w:bidi w:val="0"/>
+        <w:jc w:val="left"/>
+        <w:rPr/>
+      </w:pPr>
+      <w:r>
+        <w:rPr/>
+      </w:r>
+    </w:p>
+    <w:p>
+      <w:pPr>
+        <w:pStyle w:val="Normal"/>
+        <w:bidi w:val="0"/>
+        <w:jc w:val="left"/>
+        <w:rPr/>
+      </w:pPr>
+      <w:r>
+        <w:rPr/>
+      </w:r>
+    </w:p>
+    <w:p>
+      <w:pPr>
+        <w:pStyle w:val="Normal"/>
+        <w:bidi w:val="0"/>
+        <w:jc w:val="left"/>
+        <w:rPr/>
+      </w:pPr>
+      <w:r>
+        <w:rPr/>
+      </w:r>
+    </w:p>
+    <w:p>
+      <w:pPr>
+        <w:pStyle w:val="Normal"/>
+        <w:bidi w:val="0"/>
+        <w:jc w:val="left"/>
+        <w:rPr/>
+      </w:pPr>
+      <w:r>
+        <w:rPr/>
+      </w:r>
+    </w:p>
+    <w:p>
+      <w:pPr>
+        <w:pStyle w:val="Normal"/>
+        <w:bidi w:val="0"/>
+        <w:jc w:val="left"/>
+        <w:rPr/>
+      </w:pPr>
+      <w:r>
+        <w:rPr/>
+      </w:r>
+    </w:p>
+    <w:p>
+      <w:pPr>
+        <w:pStyle w:val="Normal"/>
+        <w:bidi w:val="0"/>
+        <w:jc w:val="left"/>
+        <w:rPr/>
+      </w:pPr>
+      <w:r>
+        <w:rPr/>
+      </w:r>
+    </w:p>
+    <w:p>
+      <w:pPr>
+        <w:pStyle w:val="Normal"/>
+        <w:bidi w:val="0"/>
+        <w:jc w:val="left"/>
+        <w:rPr/>
+      </w:pPr>
+      <w:r>
+        <w:rPr/>
+      </w:r>
+    </w:p>
+    <w:p>
+      <w:pPr>
+        <w:pStyle w:val="Normal"/>
+        <w:bidi w:val="0"/>
+        <w:jc w:val="left"/>
+        <w:rPr/>
+      </w:pPr>
+      <w:r>
+        <w:rPr/>
+      </w:r>
+    </w:p>
+    <w:p>
+      <w:pPr>
+        <w:pStyle w:val="Normal"/>
+        <w:bidi w:val="0"/>
+        <w:jc w:val="left"/>
+        <w:rPr/>
+      </w:pPr>
+      <w:r>
+        <w:rPr/>
+      </w:r>
+    </w:p>
+    <w:p>
+      <w:pPr>
+        <w:pStyle w:val="Normal"/>
+        <w:bidi w:val="0"/>
+        <w:jc w:val="left"/>
+        <w:rPr/>
+      </w:pPr>
+      <w:r>
+        <w:rPr/>
+      </w:r>
+    </w:p>
+    <w:p>
+      <w:pPr>
+        <w:pStyle w:val="Normal"/>
+        <w:bidi w:val="0"/>
+        <w:jc w:val="left"/>
+        <w:rPr/>
+      </w:pPr>
+      <w:r>
+        <w:rPr/>
+      </w:r>
+    </w:p>
+    <w:p>
+      <w:pPr>
+        <w:pStyle w:val="Normal"/>
+        <w:bidi w:val="0"/>
+        <w:jc w:val="left"/>
+        <w:rPr/>
+      </w:pPr>
+      <w:r>
+        <w:rPr/>
+      </w:r>
+    </w:p>
+    <w:p>
+      <w:pPr>
+        <w:pStyle w:val="Normal"/>
+        <w:bidi w:val="0"/>
+        <w:jc w:val="left"/>
+        <w:rPr/>
+      </w:pPr>
+      <w:r>
+        <w:rPr/>
+      </w:r>
+    </w:p>
+    <w:p>
+      <w:pPr>
+        <w:pStyle w:val="Normal"/>
+        <w:bidi w:val="0"/>
+        <w:jc w:val="left"/>
+        <w:rPr/>
+      </w:pPr>
+      <w:r>
+        <w:rPr/>
+      </w:r>
+    </w:p>
+    <w:p>
+      <w:pPr>
+        <w:pStyle w:val="Normal"/>
+        <w:bidi w:val="0"/>
+        <w:jc w:val="left"/>
+        <w:rPr/>
+      </w:pPr>
+      <w:r>
+        <w:rPr/>
+      </w:r>
+    </w:p>
+    <w:p>
+      <w:pPr>
+        <w:pStyle w:val="Normal"/>
+        <w:bidi w:val="0"/>
+        <w:jc w:val="left"/>
+        <w:rPr/>
+      </w:pPr>
+      <w:r>
+        <w:rPr/>
+      </w:r>
+    </w:p>
+    <w:p>
+      <w:pPr>
+        <w:pStyle w:val="Normal"/>
+        <w:bidi w:val="0"/>
+        <w:jc w:val="left"/>
+        <w:rPr/>
+      </w:pPr>
+      <w:r>
+        <w:rPr/>
+      </w:r>
+    </w:p>
+    <w:p>
+      <w:pPr>
+        <w:pStyle w:val="Normal"/>
+        <w:bidi w:val="0"/>
+        <w:jc w:val="left"/>
+        <w:rPr/>
+      </w:pPr>
+      <w:r>
+        <w:rPr/>
+      </w:r>
+    </w:p>
+    <w:p>
+      <w:pPr>
+        <w:pStyle w:val="Normal"/>
+        <w:bidi w:val="0"/>
+        <w:jc w:val="left"/>
+        <w:rPr/>
+      </w:pPr>
+      <w:r>
+        <w:rPr/>
+      </w:r>
+    </w:p>
+    <w:p>
+      <w:pPr>
+        <w:pStyle w:val="Normal"/>
+        <w:bidi w:val="0"/>
+        <w:jc w:val="left"/>
+        <w:rPr/>
+      </w:pPr>
+      <w:r>
+        <w:rPr/>
+      </w:r>
+    </w:p>
+    <w:p>
+      <w:pPr>
+        <w:pStyle w:val="Normal"/>
+        <w:bidi w:val="0"/>
+        <w:jc w:val="left"/>
+        <w:rPr/>
+      </w:pPr>
+      <w:r>
+        <w:rPr/>
+      </w:r>
+    </w:p>
+    <w:p>
+      <w:pPr>
+        <w:pStyle w:val="Normal"/>
+        <w:bidi w:val="0"/>
+        <w:jc w:val="left"/>
+        <w:rPr/>
+      </w:pPr>
+      <w:r>
+        <w:rPr/>
+      </w:r>
+    </w:p>
+    <w:p>
+      <w:pPr>
+        <w:pStyle w:val="Normal"/>
+        <w:bidi w:val="0"/>
+        <w:jc w:val="left"/>
+        <w:rPr/>
+      </w:pPr>
+      <w:r>
+        <w:rPr/>
+      </w:r>
+    </w:p>
+    <w:p>
+      <w:pPr>
+        <w:pStyle w:val="Normal"/>
+        <w:bidi w:val="0"/>
+        <w:jc w:val="left"/>
+        <w:rPr/>
+      </w:pPr>
+      <w:r>
+        <w:rPr/>
+      </w:r>
+    </w:p>
+    <w:p>
+      <w:pPr>
+        <w:pStyle w:val="Normal"/>
+        <w:bidi w:val="0"/>
+        <w:jc w:val="left"/>
+        <w:rPr/>
+      </w:pPr>
+      <w:r>
+        <w:rPr/>
+      </w:r>
+    </w:p>
+    <w:p>
+      <w:pPr>
+        <w:pStyle w:val="Normal"/>
+        <w:bidi w:val="0"/>
+        <w:jc w:val="left"/>
+        <w:rPr/>
+      </w:pPr>
+      <w:r>
+        <w:rPr/>
+      </w:r>
+    </w:p>
+    <w:p>
+      <w:pPr>
+        <w:pStyle w:val="Normal"/>
+        <w:bidi w:val="0"/>
+        <w:jc w:val="left"/>
+        <w:rPr/>
+      </w:pPr>
+      <w:r>
+        <w:rPr/>
+      </w:r>
+    </w:p>
+    <w:p>
+      <w:pPr>
+        <w:pStyle w:val="Normal"/>
+        <w:bidi w:val="0"/>
+        <w:jc w:val="left"/>
+        <w:rPr/>
+      </w:pPr>
+      <w:r>
+        <w:rPr/>
+      </w:r>
+    </w:p>
+    <w:p>
+      <w:pPr>
+        <w:pStyle w:val="Normal"/>
+        <w:bidi w:val="0"/>
+        <w:jc w:val="left"/>
+        <w:rPr/>
+      </w:pPr>
+      <w:r>
+        <w:rPr/>
+      </w:r>
+    </w:p>
+    <w:p>
+      <w:pPr>
+        <w:pStyle w:val="Normal"/>
+        <w:bidi w:val="0"/>
+        <w:jc w:val="left"/>
+        <w:rPr/>
+      </w:pPr>
+      <w:r>
+        <w:rPr/>
+      </w:r>
+    </w:p>
+    <w:p>
+      <w:pPr>
+        <w:pStyle w:val="Normal"/>
+        <w:bidi w:val="0"/>
+        <w:jc w:val="left"/>
+        <w:rPr/>
+      </w:pPr>
+      <w:r>
+        <w:rPr/>
       </w:r>
     </w:p>
     <w:p>
@@ -3600,6 +5301,17 @@
       </w:pPr>
       <w:r>
         <w:rPr/>
+      </w:r>
+    </w:p>
+    <w:p>
+      <w:pPr>
+        <w:pStyle w:val="Normal"/>
+        <w:bidi w:val="0"/>
+        <w:jc w:val="left"/>
+        <w:rPr/>
+      </w:pPr>
+      <w:r>
+        <w:rPr/>
         <w:t>--- Aorist ---</w:t>
       </w:r>
     </w:p>
@@ -4035,17 +5747,6 @@
       </w:pPr>
       <w:r>
         <w:rPr/>
-      </w:r>
-    </w:p>
-    <w:p>
-      <w:pPr>
-        <w:pStyle w:val="Normal"/>
-        <w:bidi w:val="0"/>
-        <w:jc w:val="left"/>
-        <w:rPr/>
-      </w:pPr>
-      <w:r>
-        <w:rPr/>
         <w:t>=== Verbs, Subjunctive Passive ===</w:t>
       </w:r>
     </w:p>
@@ -4223,17 +5924,6 @@
       <w:r>
         <w:rPr/>
         <w:t>Strike: να έχω χτυπηθεί να έχεις χτυπηθεί να έχει χτυπηθεί να έχουμε χτυπηθεί να έχετε χτυπηθεί να έχουν χτυπηθεί</w:t>
-      </w:r>
-    </w:p>
-    <w:p>
-      <w:pPr>
-        <w:pStyle w:val="Normal"/>
-        <w:bidi w:val="0"/>
-        <w:jc w:val="left"/>
-        <w:rPr/>
-      </w:pPr>
-      <w:r>
-        <w:rPr/>
       </w:r>
     </w:p>
     <w:p>
@@ -5060,7 +6750,7 @@
     </w:r>
     <w:r>
       <w:rPr/>
-      <w:t>9</w:t>
+      <w:t>12</w:t>
     </w:r>
     <w:r>
       <w:rPr/>

</xml_diff>

<commit_message>
[236]Correct adjectives table in Demotic Greek drills
</commit_message>
<xml_diff>
--- a/site/drills/demotic-greek/answers.docx
+++ b/site/drills/demotic-greek/answers.docx
@@ -5177,7 +5177,7 @@
       </w:pPr>
       <w:r>
         <w:rPr/>
-        <w:t>--- E9 Group, -ύς, -ή, -ύ (πολύς) ---</w:t>
+        <w:t>--- E9 Group, -ύς, -ή, -ύ (πολύς*) ---</w:t>
       </w:r>
     </w:p>
     <w:p>
@@ -5201,6 +5201,18 @@
       </w:pPr>
       <w:r>
         <w:rPr/>
+        <w:t>--- * does not have voccative case forms in singular ---</w:t>
+      </w:r>
+    </w:p>
+    <w:p>
+      <w:pPr>
+        <w:pStyle w:val="Normal"/>
+        <w:bidi w:val="0"/>
+        <w:jc w:val="left"/>
+        <w:rPr/>
+      </w:pPr>
+      <w:r>
+        <w:rPr/>
       </w:r>
     </w:p>
     <w:p>
@@ -5319,7 +5331,7 @@
       </w:pPr>
       <w:r>
         <w:rPr/>
-        <w:t>Much (m. sg.): πολύς πολού πολύ</w:t>
+        <w:t>Much (m. sg.): πολύς πολλού πολύ</w:t>
       </w:r>
     </w:p>
     <w:p>
@@ -5367,7 +5379,7 @@
       </w:pPr>
       <w:r>
         <w:rPr/>
-        <w:t>Much (n. sg.): πολύ πολού πολύ</w:t>
+        <w:t>Much (n. sg.): πολύ πολλού πολύ</w:t>
       </w:r>
     </w:p>
     <w:p>
@@ -5475,17 +5487,6 @@
       <w:r>
         <w:rPr/>
         <w:t>Glutton (n. pl.): φαγάδικα φαγάδικων φαγάδικα φαγάδικα</w:t>
-      </w:r>
-    </w:p>
-    <w:p>
-      <w:pPr>
-        <w:pStyle w:val="Normal"/>
-        <w:bidi w:val="0"/>
-        <w:jc w:val="left"/>
-        <w:rPr/>
-      </w:pPr>
-      <w:r>
-        <w:rPr/>
       </w:r>
     </w:p>
     <w:p>
@@ -16647,7 +16648,7 @@
     </w:r>
     <w:r>
       <w:rPr/>
-      <w:t>30</w:t>
+      <w:t>10</w:t>
     </w:r>
     <w:r>
       <w:rPr/>

</xml_diff>

<commit_message>
[481]Add Pronouns pages to Greek Demotic drills
</commit_message>
<xml_diff>
--- a/site/drills/demotic-greek/answers.docx
+++ b/site/drills/demotic-greek/answers.docx
@@ -11,6 +11,219 @@
       </w:pPr>
       <w:r>
         <w:rPr/>
+        <w:t>=== Article ===</w:t>
+      </w:r>
+    </w:p>
+    <w:p>
+      <w:pPr>
+        <w:pStyle w:val="Normal"/>
+        <w:bidi w:val="0"/>
+        <w:jc w:val="left"/>
+        <w:rPr/>
+      </w:pPr>
+      <w:r>
+        <w:rPr/>
+      </w:r>
+    </w:p>
+    <w:p>
+      <w:pPr>
+        <w:pStyle w:val="Normal"/>
+        <w:bidi w:val="0"/>
+        <w:jc w:val="left"/>
+        <w:rPr/>
+      </w:pPr>
+      <w:r>
+        <w:rPr/>
+        <w:t>--- definite article ο η το ---</w:t>
+      </w:r>
+    </w:p>
+    <w:p>
+      <w:pPr>
+        <w:pStyle w:val="Normal"/>
+        <w:bidi w:val="0"/>
+        <w:jc w:val="left"/>
+        <w:rPr/>
+      </w:pPr>
+      <w:r>
+        <w:rPr/>
+        <w:t>--- indefinite article ένας μία ένα  ---</w:t>
+      </w:r>
+    </w:p>
+    <w:p>
+      <w:pPr>
+        <w:pStyle w:val="Normal"/>
+        <w:bidi w:val="0"/>
+        <w:jc w:val="left"/>
+        <w:rPr/>
+      </w:pPr>
+      <w:r>
+        <w:rPr/>
+      </w:r>
+    </w:p>
+    <w:p>
+      <w:pPr>
+        <w:pStyle w:val="Normal"/>
+        <w:bidi w:val="0"/>
+        <w:jc w:val="left"/>
+        <w:rPr/>
+      </w:pPr>
+      <w:r>
+        <w:rPr/>
+        <w:t>Def. m. sg.: ο του τον</w:t>
+      </w:r>
+    </w:p>
+    <w:p>
+      <w:pPr>
+        <w:pStyle w:val="Normal"/>
+        <w:bidi w:val="0"/>
+        <w:jc w:val="left"/>
+        <w:rPr/>
+      </w:pPr>
+      <w:r>
+        <w:rPr/>
+        <w:t>Def. m. pl.: οι των τους</w:t>
+      </w:r>
+    </w:p>
+    <w:p>
+      <w:pPr>
+        <w:pStyle w:val="Normal"/>
+        <w:bidi w:val="0"/>
+        <w:jc w:val="left"/>
+        <w:rPr/>
+      </w:pPr>
+      <w:r>
+        <w:rPr/>
+      </w:r>
+    </w:p>
+    <w:p>
+      <w:pPr>
+        <w:pStyle w:val="Normal"/>
+        <w:bidi w:val="0"/>
+        <w:jc w:val="left"/>
+        <w:rPr/>
+      </w:pPr>
+      <w:r>
+        <w:rPr/>
+        <w:t>Def. f. sg.: η της την</w:t>
+      </w:r>
+    </w:p>
+    <w:p>
+      <w:pPr>
+        <w:pStyle w:val="Normal"/>
+        <w:bidi w:val="0"/>
+        <w:jc w:val="left"/>
+        <w:rPr/>
+      </w:pPr>
+      <w:r>
+        <w:rPr/>
+        <w:t>Def. f. pl.: οι των τις</w:t>
+      </w:r>
+    </w:p>
+    <w:p>
+      <w:pPr>
+        <w:pStyle w:val="Normal"/>
+        <w:bidi w:val="0"/>
+        <w:jc w:val="left"/>
+        <w:rPr/>
+      </w:pPr>
+      <w:r>
+        <w:rPr/>
+      </w:r>
+    </w:p>
+    <w:p>
+      <w:pPr>
+        <w:pStyle w:val="Normal"/>
+        <w:bidi w:val="0"/>
+        <w:jc w:val="left"/>
+        <w:rPr/>
+      </w:pPr>
+      <w:r>
+        <w:rPr/>
+        <w:t>Def. n. sg.: το του το</w:t>
+      </w:r>
+    </w:p>
+    <w:p>
+      <w:pPr>
+        <w:pStyle w:val="Normal"/>
+        <w:bidi w:val="0"/>
+        <w:jc w:val="left"/>
+        <w:rPr/>
+      </w:pPr>
+      <w:r>
+        <w:rPr/>
+        <w:t>Def. nd. pl.: τα των τα</w:t>
+      </w:r>
+    </w:p>
+    <w:p>
+      <w:pPr>
+        <w:pStyle w:val="Normal"/>
+        <w:bidi w:val="0"/>
+        <w:jc w:val="left"/>
+        <w:rPr/>
+      </w:pPr>
+      <w:r>
+        <w:rPr/>
+      </w:r>
+    </w:p>
+    <w:p>
+      <w:pPr>
+        <w:pStyle w:val="Normal"/>
+        <w:bidi w:val="0"/>
+        <w:jc w:val="left"/>
+        <w:rPr/>
+      </w:pPr>
+      <w:r>
+        <w:rPr/>
+        <w:t>Indef. m. sg.: ένας ενός έναν</w:t>
+      </w:r>
+    </w:p>
+    <w:p>
+      <w:pPr>
+        <w:pStyle w:val="Normal"/>
+        <w:bidi w:val="0"/>
+        <w:jc w:val="left"/>
+        <w:rPr/>
+      </w:pPr>
+      <w:r>
+        <w:rPr/>
+        <w:t>Indef. f. sg.: μία μίας μίαν</w:t>
+      </w:r>
+    </w:p>
+    <w:p>
+      <w:pPr>
+        <w:pStyle w:val="Normal"/>
+        <w:bidi w:val="0"/>
+        <w:jc w:val="left"/>
+        <w:rPr/>
+      </w:pPr>
+      <w:r>
+        <w:rPr/>
+        <w:t>Indef. n. sg.: ένα ενός ένα</w:t>
+      </w:r>
+    </w:p>
+    <w:p>
+      <w:pPr>
+        <w:pStyle w:val="Normal"/>
+        <w:bidi w:val="0"/>
+        <w:jc w:val="left"/>
+        <w:rPr/>
+      </w:pPr>
+      <w:r>
+        <w:rPr/>
+      </w:r>
+      <w:r>
+        <w:br w:type="page"/>
+      </w:r>
+    </w:p>
+    <w:p>
+      <w:pPr>
+        <w:pStyle w:val="Normal"/>
+        <w:bidi w:val="0"/>
+        <w:jc w:val="left"/>
+        <w:rPr/>
+      </w:pPr>
+      <w:r>
+        <w:rPr/>
         <w:t>=== Nouns, Masculine, First Part ===</w:t>
       </w:r>
     </w:p>
@@ -5510,203 +5723,3247 @@
       <w:r>
         <w:rPr/>
       </w:r>
-    </w:p>
-    <w:p>
-      <w:pPr>
-        <w:pStyle w:val="Normal"/>
-        <w:bidi w:val="0"/>
-        <w:jc w:val="left"/>
-        <w:rPr/>
-      </w:pPr>
-      <w:r>
-        <w:rPr/>
-      </w:r>
-    </w:p>
-    <w:p>
-      <w:pPr>
-        <w:pStyle w:val="Normal"/>
-        <w:bidi w:val="0"/>
-        <w:jc w:val="left"/>
-        <w:rPr/>
-      </w:pPr>
-      <w:r>
-        <w:rPr/>
-      </w:r>
-    </w:p>
-    <w:p>
-      <w:pPr>
-        <w:pStyle w:val="Normal"/>
-        <w:bidi w:val="0"/>
-        <w:jc w:val="left"/>
-        <w:rPr/>
-      </w:pPr>
-      <w:r>
-        <w:rPr/>
-      </w:r>
-    </w:p>
-    <w:p>
-      <w:pPr>
-        <w:pStyle w:val="Normal"/>
-        <w:bidi w:val="0"/>
-        <w:jc w:val="left"/>
-        <w:rPr/>
-      </w:pPr>
-      <w:r>
-        <w:rPr/>
-      </w:r>
-    </w:p>
-    <w:p>
-      <w:pPr>
-        <w:pStyle w:val="Normal"/>
-        <w:bidi w:val="0"/>
-        <w:jc w:val="left"/>
-        <w:rPr/>
-      </w:pPr>
-      <w:r>
-        <w:rPr/>
-      </w:r>
-    </w:p>
-    <w:p>
-      <w:pPr>
-        <w:pStyle w:val="Normal"/>
-        <w:bidi w:val="0"/>
-        <w:jc w:val="left"/>
-        <w:rPr/>
-      </w:pPr>
-      <w:r>
-        <w:rPr/>
-      </w:r>
-    </w:p>
-    <w:p>
-      <w:pPr>
-        <w:pStyle w:val="Normal"/>
-        <w:bidi w:val="0"/>
-        <w:jc w:val="left"/>
-        <w:rPr/>
-      </w:pPr>
-      <w:r>
-        <w:rPr/>
-      </w:r>
-    </w:p>
-    <w:p>
-      <w:pPr>
-        <w:pStyle w:val="Normal"/>
-        <w:bidi w:val="0"/>
-        <w:jc w:val="left"/>
-        <w:rPr/>
-      </w:pPr>
-      <w:r>
-        <w:rPr/>
-      </w:r>
-    </w:p>
-    <w:p>
-      <w:pPr>
-        <w:pStyle w:val="Normal"/>
-        <w:bidi w:val="0"/>
-        <w:jc w:val="left"/>
-        <w:rPr/>
-      </w:pPr>
-      <w:r>
-        <w:rPr/>
-      </w:r>
-    </w:p>
-    <w:p>
-      <w:pPr>
-        <w:pStyle w:val="Normal"/>
-        <w:bidi w:val="0"/>
-        <w:jc w:val="left"/>
-        <w:rPr/>
-      </w:pPr>
-      <w:r>
-        <w:rPr/>
-      </w:r>
-    </w:p>
-    <w:p>
-      <w:pPr>
-        <w:pStyle w:val="Normal"/>
-        <w:bidi w:val="0"/>
-        <w:jc w:val="left"/>
-        <w:rPr/>
-      </w:pPr>
-      <w:r>
-        <w:rPr/>
-      </w:r>
-    </w:p>
-    <w:p>
-      <w:pPr>
-        <w:pStyle w:val="Normal"/>
-        <w:bidi w:val="0"/>
-        <w:jc w:val="left"/>
-        <w:rPr/>
-      </w:pPr>
-      <w:r>
-        <w:rPr/>
-      </w:r>
-    </w:p>
-    <w:p>
-      <w:pPr>
-        <w:pStyle w:val="Normal"/>
-        <w:bidi w:val="0"/>
-        <w:jc w:val="left"/>
-        <w:rPr/>
-      </w:pPr>
-      <w:r>
-        <w:rPr/>
-      </w:r>
-    </w:p>
-    <w:p>
-      <w:pPr>
-        <w:pStyle w:val="Normal"/>
-        <w:bidi w:val="0"/>
-        <w:jc w:val="left"/>
-        <w:rPr/>
-      </w:pPr>
-      <w:r>
-        <w:rPr/>
-      </w:r>
-    </w:p>
-    <w:p>
-      <w:pPr>
-        <w:pStyle w:val="Normal"/>
-        <w:bidi w:val="0"/>
-        <w:jc w:val="left"/>
-        <w:rPr/>
-      </w:pPr>
-      <w:r>
-        <w:rPr/>
-      </w:r>
-    </w:p>
-    <w:p>
-      <w:pPr>
-        <w:pStyle w:val="Normal"/>
-        <w:bidi w:val="0"/>
-        <w:jc w:val="left"/>
-        <w:rPr/>
-      </w:pPr>
-      <w:r>
-        <w:rPr/>
-      </w:r>
-    </w:p>
-    <w:p>
-      <w:pPr>
-        <w:pStyle w:val="Normal"/>
-        <w:bidi w:val="0"/>
-        <w:jc w:val="left"/>
-        <w:rPr/>
-      </w:pPr>
-      <w:r>
-        <w:rPr/>
-      </w:r>
-    </w:p>
-    <w:p>
-      <w:pPr>
-        <w:pStyle w:val="Normal"/>
-        <w:bidi w:val="0"/>
-        <w:jc w:val="left"/>
-        <w:rPr/>
-      </w:pPr>
-      <w:r>
-        <w:rPr/>
+      <w:r>
+        <w:br w:type="page"/>
+      </w:r>
+    </w:p>
+    <w:p>
+      <w:pPr>
+        <w:pStyle w:val="Normal"/>
+        <w:bidi w:val="0"/>
+        <w:jc w:val="left"/>
+        <w:rPr/>
+      </w:pPr>
+      <w:r>
+        <w:rPr/>
+        <w:t>=== Pronouns, Personal ===</w:t>
+      </w:r>
+    </w:p>
+    <w:p>
+      <w:pPr>
+        <w:pStyle w:val="Normal"/>
+        <w:bidi w:val="0"/>
+        <w:jc w:val="left"/>
+        <w:rPr/>
+      </w:pPr>
+      <w:r>
+        <w:rPr/>
+      </w:r>
+    </w:p>
+    <w:p>
+      <w:pPr>
+        <w:pStyle w:val="Normal"/>
+        <w:bidi w:val="0"/>
+        <w:jc w:val="left"/>
+        <w:rPr/>
+      </w:pPr>
+      <w:r>
+        <w:rPr/>
+        <w:t>--- εγώ ---</w:t>
+      </w:r>
+    </w:p>
+    <w:p>
+      <w:pPr>
+        <w:pStyle w:val="Normal"/>
+        <w:bidi w:val="0"/>
+        <w:jc w:val="left"/>
+        <w:rPr/>
+      </w:pPr>
+      <w:r>
+        <w:rPr/>
+        <w:t>--- εσύ ---</w:t>
+      </w:r>
+    </w:p>
+    <w:p>
+      <w:pPr>
+        <w:pStyle w:val="Normal"/>
+        <w:bidi w:val="0"/>
+        <w:jc w:val="left"/>
+        <w:rPr/>
+      </w:pPr>
+      <w:r>
+        <w:rPr/>
+        <w:t>--- αυτός αυτή αυτό ---</w:t>
+      </w:r>
+    </w:p>
+    <w:p>
+      <w:pPr>
+        <w:pStyle w:val="Normal"/>
+        <w:bidi w:val="0"/>
+        <w:jc w:val="left"/>
+        <w:rPr/>
+      </w:pPr>
+      <w:r>
+        <w:rPr/>
+        <w:t>--- εμείς ---</w:t>
+      </w:r>
+    </w:p>
+    <w:p>
+      <w:pPr>
+        <w:pStyle w:val="Normal"/>
+        <w:bidi w:val="0"/>
+        <w:jc w:val="left"/>
+        <w:rPr/>
+      </w:pPr>
+      <w:r>
+        <w:rPr/>
+        <w:t>--- εσείς ---</w:t>
+      </w:r>
+    </w:p>
+    <w:p>
+      <w:pPr>
+        <w:pStyle w:val="Normal"/>
+        <w:bidi w:val="0"/>
+        <w:jc w:val="left"/>
+        <w:rPr/>
+      </w:pPr>
+      <w:r>
+        <w:rPr/>
+        <w:t>--- αυτοί αυτές αυτά ---</w:t>
+      </w:r>
+    </w:p>
+    <w:p>
+      <w:pPr>
+        <w:pStyle w:val="Normal"/>
+        <w:bidi w:val="0"/>
+        <w:jc w:val="left"/>
+        <w:rPr/>
+      </w:pPr>
+      <w:r>
+        <w:rPr/>
+      </w:r>
+    </w:p>
+    <w:p>
+      <w:pPr>
+        <w:pStyle w:val="Normal"/>
+        <w:bidi w:val="0"/>
+        <w:jc w:val="left"/>
+        <w:rPr/>
+      </w:pPr>
+      <w:r>
+        <w:rPr/>
+        <w:t>I: εγώ εμένα εμένα</w:t>
+      </w:r>
+    </w:p>
+    <w:p>
+      <w:pPr>
+        <w:pStyle w:val="Normal"/>
+        <w:bidi w:val="0"/>
+        <w:jc w:val="left"/>
+        <w:rPr/>
+      </w:pPr>
+      <w:r>
+        <w:rPr/>
+        <w:t>I (unemphatic): μου με</w:t>
+      </w:r>
+    </w:p>
+    <w:p>
+      <w:pPr>
+        <w:pStyle w:val="Normal"/>
+        <w:bidi w:val="0"/>
+        <w:jc w:val="left"/>
+        <w:rPr/>
+      </w:pPr>
+      <w:r>
+        <w:rPr/>
+      </w:r>
+    </w:p>
+    <w:p>
+      <w:pPr>
+        <w:pStyle w:val="Normal"/>
+        <w:bidi w:val="0"/>
+        <w:jc w:val="left"/>
+        <w:rPr/>
+      </w:pPr>
+      <w:r>
+        <w:rPr/>
+        <w:t>Thou: εσύ εσένα εσένα</w:t>
+      </w:r>
+    </w:p>
+    <w:p>
+      <w:pPr>
+        <w:pStyle w:val="Normal"/>
+        <w:bidi w:val="0"/>
+        <w:jc w:val="left"/>
+        <w:rPr/>
+      </w:pPr>
+      <w:r>
+        <w:rPr/>
+        <w:t>Thou (unemphatic): σου σε</w:t>
+      </w:r>
+    </w:p>
+    <w:p>
+      <w:pPr>
+        <w:pStyle w:val="Normal"/>
+        <w:bidi w:val="0"/>
+        <w:jc w:val="left"/>
+        <w:rPr/>
+      </w:pPr>
+      <w:r>
+        <w:rPr/>
+      </w:r>
+    </w:p>
+    <w:p>
+      <w:pPr>
+        <w:pStyle w:val="Normal"/>
+        <w:bidi w:val="0"/>
+        <w:jc w:val="left"/>
+        <w:rPr/>
+      </w:pPr>
+      <w:r>
+        <w:rPr/>
+        <w:t>He: αυτός αυτού αυτόν</w:t>
+      </w:r>
+    </w:p>
+    <w:p>
+      <w:pPr>
+        <w:pStyle w:val="Normal"/>
+        <w:bidi w:val="0"/>
+        <w:jc w:val="left"/>
+        <w:rPr/>
+      </w:pPr>
+      <w:r>
+        <w:rPr/>
+        <w:t>He (unemphatic): του τον</w:t>
+      </w:r>
+    </w:p>
+    <w:p>
+      <w:pPr>
+        <w:pStyle w:val="Normal"/>
+        <w:bidi w:val="0"/>
+        <w:jc w:val="left"/>
+        <w:rPr/>
+      </w:pPr>
+      <w:r>
+        <w:rPr/>
+      </w:r>
+    </w:p>
+    <w:p>
+      <w:pPr>
+        <w:pStyle w:val="Normal"/>
+        <w:bidi w:val="0"/>
+        <w:jc w:val="left"/>
+        <w:rPr/>
+      </w:pPr>
+      <w:r>
+        <w:rPr/>
+        <w:t>She: αυτή αυτής αυτήν</w:t>
+      </w:r>
+    </w:p>
+    <w:p>
+      <w:pPr>
+        <w:pStyle w:val="Normal"/>
+        <w:bidi w:val="0"/>
+        <w:jc w:val="left"/>
+        <w:rPr/>
+      </w:pPr>
+      <w:r>
+        <w:rPr/>
+        <w:t>She (unemphatic): της την</w:t>
+      </w:r>
+    </w:p>
+    <w:p>
+      <w:pPr>
+        <w:pStyle w:val="Normal"/>
+        <w:bidi w:val="0"/>
+        <w:jc w:val="left"/>
+        <w:rPr/>
+      </w:pPr>
+      <w:r>
+        <w:rPr/>
+      </w:r>
+    </w:p>
+    <w:p>
+      <w:pPr>
+        <w:pStyle w:val="Normal"/>
+        <w:bidi w:val="0"/>
+        <w:jc w:val="left"/>
+        <w:rPr/>
+      </w:pPr>
+      <w:r>
+        <w:rPr/>
+        <w:t>It: αυτό αυτού αυτό</w:t>
+      </w:r>
+    </w:p>
+    <w:p>
+      <w:pPr>
+        <w:pStyle w:val="Normal"/>
+        <w:bidi w:val="0"/>
+        <w:jc w:val="left"/>
+        <w:rPr/>
+      </w:pPr>
+      <w:r>
+        <w:rPr/>
+        <w:t>It (unemphatic): του το</w:t>
+      </w:r>
+    </w:p>
+    <w:p>
+      <w:pPr>
+        <w:pStyle w:val="Normal"/>
+        <w:bidi w:val="0"/>
+        <w:jc w:val="left"/>
+        <w:rPr/>
+      </w:pPr>
+      <w:r>
+        <w:rPr/>
+      </w:r>
+    </w:p>
+    <w:p>
+      <w:pPr>
+        <w:pStyle w:val="Normal"/>
+        <w:bidi w:val="0"/>
+        <w:jc w:val="left"/>
+        <w:rPr/>
+      </w:pPr>
+      <w:r>
+        <w:rPr/>
+        <w:t>We: εμείς εμάς εμάς</w:t>
+      </w:r>
+    </w:p>
+    <w:p>
+      <w:pPr>
+        <w:pStyle w:val="Normal"/>
+        <w:bidi w:val="0"/>
+        <w:jc w:val="left"/>
+        <w:rPr/>
+      </w:pPr>
+      <w:r>
+        <w:rPr/>
+        <w:t>We (unemphatic): μας μας</w:t>
+      </w:r>
+    </w:p>
+    <w:p>
+      <w:pPr>
+        <w:pStyle w:val="Normal"/>
+        <w:bidi w:val="0"/>
+        <w:jc w:val="left"/>
+        <w:rPr/>
+      </w:pPr>
+      <w:r>
+        <w:rPr/>
+      </w:r>
+    </w:p>
+    <w:p>
+      <w:pPr>
+        <w:pStyle w:val="Normal"/>
+        <w:bidi w:val="0"/>
+        <w:jc w:val="left"/>
+        <w:rPr/>
+      </w:pPr>
+      <w:r>
+        <w:rPr/>
+        <w:t>You: εσείς εσάς εσάς</w:t>
+      </w:r>
+    </w:p>
+    <w:p>
+      <w:pPr>
+        <w:pStyle w:val="Normal"/>
+        <w:bidi w:val="0"/>
+        <w:jc w:val="left"/>
+        <w:rPr/>
+      </w:pPr>
+      <w:r>
+        <w:rPr/>
+        <w:t>You (unemphatic): σας σας</w:t>
+      </w:r>
+    </w:p>
+    <w:p>
+      <w:pPr>
+        <w:pStyle w:val="Normal"/>
+        <w:bidi w:val="0"/>
+        <w:jc w:val="left"/>
+        <w:rPr/>
+      </w:pPr>
+      <w:r>
+        <w:rPr/>
+      </w:r>
+    </w:p>
+    <w:p>
+      <w:pPr>
+        <w:pStyle w:val="Normal"/>
+        <w:bidi w:val="0"/>
+        <w:jc w:val="left"/>
+        <w:rPr/>
+      </w:pPr>
+      <w:r>
+        <w:rPr/>
+        <w:t>They (m.): αυτοί αυτών αυτούς</w:t>
+      </w:r>
+    </w:p>
+    <w:p>
+      <w:pPr>
+        <w:pStyle w:val="Normal"/>
+        <w:bidi w:val="0"/>
+        <w:jc w:val="left"/>
+        <w:rPr/>
+      </w:pPr>
+      <w:r>
+        <w:rPr/>
+        <w:t>They (m. unemphatic): τους τους</w:t>
+      </w:r>
+    </w:p>
+    <w:p>
+      <w:pPr>
+        <w:pStyle w:val="Normal"/>
+        <w:bidi w:val="0"/>
+        <w:jc w:val="left"/>
+        <w:rPr/>
+      </w:pPr>
+      <w:r>
+        <w:rPr/>
+      </w:r>
+    </w:p>
+    <w:p>
+      <w:pPr>
+        <w:pStyle w:val="Normal"/>
+        <w:bidi w:val="0"/>
+        <w:jc w:val="left"/>
+        <w:rPr/>
+      </w:pPr>
+      <w:r>
+        <w:rPr/>
+        <w:t>They (f.): αυτές αυτών αυτές</w:t>
+      </w:r>
+    </w:p>
+    <w:p>
+      <w:pPr>
+        <w:pStyle w:val="Normal"/>
+        <w:bidi w:val="0"/>
+        <w:jc w:val="left"/>
+        <w:rPr/>
+      </w:pPr>
+      <w:r>
+        <w:rPr/>
+        <w:t>They (f. unemphatic): τους τες</w:t>
+      </w:r>
+    </w:p>
+    <w:p>
+      <w:pPr>
+        <w:pStyle w:val="Normal"/>
+        <w:bidi w:val="0"/>
+        <w:jc w:val="left"/>
+        <w:rPr/>
+      </w:pPr>
+      <w:r>
+        <w:rPr/>
+      </w:r>
+    </w:p>
+    <w:p>
+      <w:pPr>
+        <w:pStyle w:val="Normal"/>
+        <w:bidi w:val="0"/>
+        <w:jc w:val="left"/>
+        <w:rPr/>
+      </w:pPr>
+      <w:r>
+        <w:rPr/>
+        <w:t>They (n.): αυτά αυτών αυτά</w:t>
+      </w:r>
+    </w:p>
+    <w:p>
+      <w:pPr>
+        <w:pStyle w:val="Normal"/>
+        <w:bidi w:val="0"/>
+        <w:jc w:val="left"/>
+        <w:rPr/>
+      </w:pPr>
+      <w:r>
+        <w:rPr/>
+        <w:t>They (n. unemphatic): τους τα</w:t>
+      </w:r>
+    </w:p>
+    <w:p>
+      <w:pPr>
+        <w:pStyle w:val="Normal"/>
+        <w:bidi w:val="0"/>
+        <w:jc w:val="left"/>
+        <w:rPr/>
+      </w:pPr>
+      <w:r>
+        <w:rPr/>
+      </w:r>
+    </w:p>
+    <w:p>
+      <w:pPr>
+        <w:pStyle w:val="Normal"/>
+        <w:bidi w:val="0"/>
+        <w:jc w:val="left"/>
+        <w:rPr/>
+      </w:pPr>
+      <w:r>
+        <w:rPr/>
+      </w:r>
+      <w:r>
+        <w:br w:type="page"/>
+      </w:r>
+    </w:p>
+    <w:p>
+      <w:pPr>
+        <w:pStyle w:val="Normal"/>
+        <w:bidi w:val="0"/>
+        <w:jc w:val="left"/>
+        <w:rPr/>
+      </w:pPr>
+      <w:r>
+        <w:rPr/>
+        <w:t>=== Pronouns, Possessive ===</w:t>
+      </w:r>
+    </w:p>
+    <w:p>
+      <w:pPr>
+        <w:pStyle w:val="Normal"/>
+        <w:bidi w:val="0"/>
+        <w:jc w:val="left"/>
+        <w:rPr/>
+      </w:pPr>
+      <w:r>
+        <w:rPr/>
+      </w:r>
+    </w:p>
+    <w:p>
+      <w:pPr>
+        <w:pStyle w:val="Normal"/>
+        <w:bidi w:val="0"/>
+        <w:jc w:val="left"/>
+        <w:rPr/>
+      </w:pPr>
+      <w:r>
+        <w:rPr/>
+        <w:t>--- 1-st person possessive μου ---</w:t>
+      </w:r>
+    </w:p>
+    <w:p>
+      <w:pPr>
+        <w:pStyle w:val="Normal"/>
+        <w:bidi w:val="0"/>
+        <w:jc w:val="left"/>
+        <w:rPr/>
+      </w:pPr>
+      <w:r>
+        <w:rPr/>
+        <w:t>--- 2-nd person possessive σου ---</w:t>
+      </w:r>
+    </w:p>
+    <w:p>
+      <w:pPr>
+        <w:pStyle w:val="Normal"/>
+        <w:bidi w:val="0"/>
+        <w:jc w:val="left"/>
+        <w:rPr/>
+      </w:pPr>
+      <w:r>
+        <w:rPr/>
+        <w:t>--- 3-rd person possessive του ---</w:t>
+      </w:r>
+    </w:p>
+    <w:p>
+      <w:pPr>
+        <w:pStyle w:val="Normal"/>
+        <w:bidi w:val="0"/>
+        <w:jc w:val="left"/>
+        <w:rPr/>
+      </w:pPr>
+      <w:r>
+        <w:rPr/>
+        <w:t>--- 1-st person possessive δικός μου δική μου δικό μου ---</w:t>
+      </w:r>
+    </w:p>
+    <w:p>
+      <w:pPr>
+        <w:pStyle w:val="Normal"/>
+        <w:bidi w:val="0"/>
+        <w:jc w:val="left"/>
+        <w:rPr/>
+      </w:pPr>
+      <w:r>
+        <w:rPr/>
+        <w:t>--- 2-nd person possessive δικός σου δική σου δικό σου ---</w:t>
+      </w:r>
+    </w:p>
+    <w:p>
+      <w:pPr>
+        <w:pStyle w:val="Normal"/>
+        <w:bidi w:val="0"/>
+        <w:jc w:val="left"/>
+        <w:rPr/>
+      </w:pPr>
+      <w:r>
+        <w:rPr/>
+        <w:t>--- 3-rd person possessive δικός του δική της δική του ---</w:t>
+      </w:r>
+    </w:p>
+    <w:p>
+      <w:pPr>
+        <w:pStyle w:val="Normal"/>
+        <w:bidi w:val="0"/>
+        <w:jc w:val="left"/>
+        <w:rPr/>
+      </w:pPr>
+      <w:r>
+        <w:rPr/>
+      </w:r>
+    </w:p>
+    <w:p>
+      <w:pPr>
+        <w:pStyle w:val="Normal"/>
+        <w:bidi w:val="0"/>
+        <w:jc w:val="left"/>
+        <w:rPr/>
+      </w:pPr>
+      <w:r>
+        <w:rPr/>
+        <w:t>My: μου</w:t>
+      </w:r>
+    </w:p>
+    <w:p>
+      <w:pPr>
+        <w:pStyle w:val="Normal"/>
+        <w:bidi w:val="0"/>
+        <w:jc w:val="left"/>
+        <w:rPr/>
+      </w:pPr>
+      <w:r>
+        <w:rPr/>
+        <w:t>Your: σου</w:t>
+      </w:r>
+    </w:p>
+    <w:p>
+      <w:pPr>
+        <w:pStyle w:val="Normal"/>
+        <w:bidi w:val="0"/>
+        <w:jc w:val="left"/>
+        <w:rPr/>
+      </w:pPr>
+      <w:r>
+        <w:rPr/>
+        <w:t>His: του</w:t>
+      </w:r>
+    </w:p>
+    <w:p>
+      <w:pPr>
+        <w:pStyle w:val="Normal"/>
+        <w:bidi w:val="0"/>
+        <w:jc w:val="left"/>
+        <w:rPr/>
+      </w:pPr>
+      <w:r>
+        <w:rPr/>
+        <w:t>Her: της</w:t>
+      </w:r>
+    </w:p>
+    <w:p>
+      <w:pPr>
+        <w:pStyle w:val="Normal"/>
+        <w:bidi w:val="0"/>
+        <w:jc w:val="left"/>
+        <w:rPr/>
+      </w:pPr>
+      <w:r>
+        <w:rPr/>
+        <w:t>Its: του</w:t>
+      </w:r>
+    </w:p>
+    <w:p>
+      <w:pPr>
+        <w:pStyle w:val="Normal"/>
+        <w:bidi w:val="0"/>
+        <w:jc w:val="left"/>
+        <w:rPr/>
+      </w:pPr>
+      <w:r>
+        <w:rPr/>
+        <w:t>Our: μας</w:t>
+      </w:r>
+    </w:p>
+    <w:p>
+      <w:pPr>
+        <w:pStyle w:val="Normal"/>
+        <w:bidi w:val="0"/>
+        <w:jc w:val="left"/>
+        <w:rPr/>
+      </w:pPr>
+      <w:r>
+        <w:rPr/>
+        <w:t>Your: σας</w:t>
+      </w:r>
+    </w:p>
+    <w:p>
+      <w:pPr>
+        <w:pStyle w:val="Normal"/>
+        <w:bidi w:val="0"/>
+        <w:jc w:val="left"/>
+        <w:rPr/>
+      </w:pPr>
+      <w:r>
+        <w:rPr/>
+        <w:t>Their: τους</w:t>
+      </w:r>
+    </w:p>
+    <w:p>
+      <w:pPr>
+        <w:pStyle w:val="Normal"/>
+        <w:bidi w:val="0"/>
+        <w:jc w:val="left"/>
+        <w:rPr/>
+      </w:pPr>
+      <w:r>
+        <w:rPr/>
+      </w:r>
+    </w:p>
+    <w:p>
+      <w:pPr>
+        <w:pStyle w:val="Normal"/>
+        <w:bidi w:val="0"/>
+        <w:jc w:val="left"/>
+        <w:rPr/>
+      </w:pPr>
+      <w:r>
+        <w:rPr/>
+        <w:t>Mine (m. sg.): δικός μου δικού μου δικό μου</w:t>
+      </w:r>
+    </w:p>
+    <w:p>
+      <w:pPr>
+        <w:pStyle w:val="Normal"/>
+        <w:bidi w:val="0"/>
+        <w:jc w:val="left"/>
+        <w:rPr/>
+      </w:pPr>
+      <w:r>
+        <w:rPr/>
+        <w:t>Mine (m. pl.): δικοί μου δικών μου δικούς μου</w:t>
+      </w:r>
+    </w:p>
+    <w:p>
+      <w:pPr>
+        <w:pStyle w:val="Normal"/>
+        <w:bidi w:val="0"/>
+        <w:jc w:val="left"/>
+        <w:rPr/>
+      </w:pPr>
+      <w:r>
+        <w:rPr/>
+        <w:t>Mine (f. sg.): δική μου δικής μου δική μου</w:t>
+      </w:r>
+    </w:p>
+    <w:p>
+      <w:pPr>
+        <w:pStyle w:val="Normal"/>
+        <w:bidi w:val="0"/>
+        <w:jc w:val="left"/>
+        <w:rPr/>
+      </w:pPr>
+      <w:r>
+        <w:rPr/>
+        <w:t>Mine (f. pl.): δικές μου δικών μου δικές μου</w:t>
+      </w:r>
+    </w:p>
+    <w:p>
+      <w:pPr>
+        <w:pStyle w:val="Normal"/>
+        <w:bidi w:val="0"/>
+        <w:jc w:val="left"/>
+        <w:rPr/>
+      </w:pPr>
+      <w:r>
+        <w:rPr/>
+        <w:t>Mine (n. sg.): δικό μου δικού μου δικό μου</w:t>
+      </w:r>
+    </w:p>
+    <w:p>
+      <w:pPr>
+        <w:pStyle w:val="Normal"/>
+        <w:bidi w:val="0"/>
+        <w:jc w:val="left"/>
+        <w:rPr/>
+      </w:pPr>
+      <w:r>
+        <w:rPr/>
+        <w:t>Mine (n. pl.): δικά μου δικών μου δικά μου</w:t>
+      </w:r>
+    </w:p>
+    <w:p>
+      <w:pPr>
+        <w:pStyle w:val="Normal"/>
+        <w:bidi w:val="0"/>
+        <w:jc w:val="left"/>
+        <w:rPr/>
+      </w:pPr>
+      <w:r>
+        <w:rPr/>
+      </w:r>
+    </w:p>
+    <w:p>
+      <w:pPr>
+        <w:pStyle w:val="Normal"/>
+        <w:bidi w:val="0"/>
+        <w:jc w:val="left"/>
+        <w:rPr/>
+      </w:pPr>
+      <w:r>
+        <w:rPr/>
+        <w:t>Yours (m. sg.): δικός σου δικού σου δικό σου</w:t>
+      </w:r>
+    </w:p>
+    <w:p>
+      <w:pPr>
+        <w:pStyle w:val="Normal"/>
+        <w:bidi w:val="0"/>
+        <w:jc w:val="left"/>
+        <w:rPr/>
+      </w:pPr>
+      <w:r>
+        <w:rPr/>
+        <w:t>Yours (m. pl.): δικοί σου δικών σου δικούς σου</w:t>
+      </w:r>
+    </w:p>
+    <w:p>
+      <w:pPr>
+        <w:pStyle w:val="Normal"/>
+        <w:bidi w:val="0"/>
+        <w:jc w:val="left"/>
+        <w:rPr/>
+      </w:pPr>
+      <w:r>
+        <w:rPr/>
+        <w:t>Yours (f. sg.): δική σου δικής σου δική σου</w:t>
+      </w:r>
+    </w:p>
+    <w:p>
+      <w:pPr>
+        <w:pStyle w:val="Normal"/>
+        <w:bidi w:val="0"/>
+        <w:jc w:val="left"/>
+        <w:rPr/>
+      </w:pPr>
+      <w:r>
+        <w:rPr/>
+        <w:t>Yours (f. pl.): δικές σου δικών σου δικές σου</w:t>
+      </w:r>
+    </w:p>
+    <w:p>
+      <w:pPr>
+        <w:pStyle w:val="Normal"/>
+        <w:bidi w:val="0"/>
+        <w:jc w:val="left"/>
+        <w:rPr/>
+      </w:pPr>
+      <w:r>
+        <w:rPr/>
+        <w:t>Yours (n. sg.): δικός σου δικού σου δικό σου</w:t>
+      </w:r>
+    </w:p>
+    <w:p>
+      <w:pPr>
+        <w:pStyle w:val="Normal"/>
+        <w:bidi w:val="0"/>
+        <w:jc w:val="left"/>
+        <w:rPr/>
+      </w:pPr>
+      <w:r>
+        <w:rPr/>
+        <w:t>Yours (n. pl.): δικά σου δικών σου δικά σου</w:t>
+      </w:r>
+    </w:p>
+    <w:p>
+      <w:pPr>
+        <w:pStyle w:val="Normal"/>
+        <w:bidi w:val="0"/>
+        <w:jc w:val="left"/>
+        <w:rPr/>
+      </w:pPr>
+      <w:r>
+        <w:rPr/>
+      </w:r>
+    </w:p>
+    <w:p>
+      <w:pPr>
+        <w:pStyle w:val="Normal"/>
+        <w:bidi w:val="0"/>
+        <w:jc w:val="left"/>
+        <w:rPr/>
+      </w:pPr>
+      <w:r>
+        <w:rPr/>
+        <w:t>His (m. sg.): δικός του δικού του δικό του</w:t>
+      </w:r>
+    </w:p>
+    <w:p>
+      <w:pPr>
+        <w:pStyle w:val="Normal"/>
+        <w:bidi w:val="0"/>
+        <w:jc w:val="left"/>
+        <w:rPr/>
+      </w:pPr>
+      <w:r>
+        <w:rPr/>
+        <w:t>His (m. pl.): δικοί του δικών του δικούς του</w:t>
+      </w:r>
+    </w:p>
+    <w:p>
+      <w:pPr>
+        <w:pStyle w:val="Normal"/>
+        <w:bidi w:val="0"/>
+        <w:jc w:val="left"/>
+        <w:rPr/>
+      </w:pPr>
+      <w:r>
+        <w:rPr/>
+        <w:t>His (f. sg.): δική του δικής του δική του</w:t>
+      </w:r>
+    </w:p>
+    <w:p>
+      <w:pPr>
+        <w:pStyle w:val="Normal"/>
+        <w:bidi w:val="0"/>
+        <w:jc w:val="left"/>
+        <w:rPr/>
+      </w:pPr>
+      <w:r>
+        <w:rPr/>
+        <w:t>His (f. pl.): δικές του δικών του δικές του</w:t>
+      </w:r>
+    </w:p>
+    <w:p>
+      <w:pPr>
+        <w:pStyle w:val="Normal"/>
+        <w:bidi w:val="0"/>
+        <w:jc w:val="left"/>
+        <w:rPr/>
+      </w:pPr>
+      <w:r>
+        <w:rPr/>
+        <w:t>His (n. sg.): δικό του δικού του δικό του</w:t>
+      </w:r>
+    </w:p>
+    <w:p>
+      <w:pPr>
+        <w:pStyle w:val="Normal"/>
+        <w:bidi w:val="0"/>
+        <w:jc w:val="left"/>
+        <w:rPr/>
+      </w:pPr>
+      <w:r>
+        <w:rPr/>
+        <w:t>His (n. pl.): δικά του δικών του δικά του</w:t>
+      </w:r>
+    </w:p>
+    <w:p>
+      <w:pPr>
+        <w:pStyle w:val="Normal"/>
+        <w:bidi w:val="0"/>
+        <w:jc w:val="left"/>
+        <w:rPr/>
+      </w:pPr>
+      <w:r>
+        <w:rPr/>
+      </w:r>
+    </w:p>
+    <w:p>
+      <w:pPr>
+        <w:pStyle w:val="Normal"/>
+        <w:bidi w:val="0"/>
+        <w:jc w:val="left"/>
+        <w:rPr/>
+      </w:pPr>
+      <w:r>
+        <w:rPr/>
+        <w:t>Hers (m. sg.): δικός της δικού της δικό της</w:t>
+      </w:r>
+    </w:p>
+    <w:p>
+      <w:pPr>
+        <w:pStyle w:val="Normal"/>
+        <w:bidi w:val="0"/>
+        <w:jc w:val="left"/>
+        <w:rPr/>
+      </w:pPr>
+      <w:r>
+        <w:rPr/>
+        <w:t>Hers (m. pl.): δικοί της δικών της δικούς της</w:t>
+      </w:r>
+    </w:p>
+    <w:p>
+      <w:pPr>
+        <w:pStyle w:val="Normal"/>
+        <w:bidi w:val="0"/>
+        <w:jc w:val="left"/>
+        <w:rPr/>
+      </w:pPr>
+      <w:r>
+        <w:rPr/>
+        <w:t>Hers (f. sg.): δική της δικής της δική της</w:t>
+      </w:r>
+    </w:p>
+    <w:p>
+      <w:pPr>
+        <w:pStyle w:val="Normal"/>
+        <w:bidi w:val="0"/>
+        <w:jc w:val="left"/>
+        <w:rPr/>
+      </w:pPr>
+      <w:r>
+        <w:rPr/>
+        <w:t>Hers (f. pl.): δικές της δικών της δικές της</w:t>
+      </w:r>
+    </w:p>
+    <w:p>
+      <w:pPr>
+        <w:pStyle w:val="Normal"/>
+        <w:bidi w:val="0"/>
+        <w:jc w:val="left"/>
+        <w:rPr/>
+      </w:pPr>
+      <w:r>
+        <w:rPr/>
+        <w:t>Hers (n. sg.): δικό της δικού της δικό της</w:t>
+      </w:r>
+    </w:p>
+    <w:p>
+      <w:pPr>
+        <w:pStyle w:val="Normal"/>
+        <w:bidi w:val="0"/>
+        <w:jc w:val="left"/>
+        <w:rPr/>
+      </w:pPr>
+      <w:r>
+        <w:rPr/>
+        <w:t>Hers (n. pl.): δικά της δικών της δικά της</w:t>
+      </w:r>
+    </w:p>
+    <w:p>
+      <w:pPr>
+        <w:pStyle w:val="Normal"/>
+        <w:bidi w:val="0"/>
+        <w:jc w:val="left"/>
+        <w:rPr/>
+      </w:pPr>
+      <w:r>
+        <w:rPr/>
+      </w:r>
+    </w:p>
+    <w:p>
+      <w:pPr>
+        <w:pStyle w:val="Normal"/>
+        <w:bidi w:val="0"/>
+        <w:jc w:val="left"/>
+        <w:rPr/>
+      </w:pPr>
+      <w:r>
+        <w:rPr/>
+        <w:t>Its (m. sg.): δικός του δικού του δικό του</w:t>
+      </w:r>
+    </w:p>
+    <w:p>
+      <w:pPr>
+        <w:pStyle w:val="Normal"/>
+        <w:bidi w:val="0"/>
+        <w:jc w:val="left"/>
+        <w:rPr/>
+      </w:pPr>
+      <w:r>
+        <w:rPr/>
+        <w:t>Its (m. pl.): δικοί του δικών του δικούς του</w:t>
+      </w:r>
+    </w:p>
+    <w:p>
+      <w:pPr>
+        <w:pStyle w:val="Normal"/>
+        <w:bidi w:val="0"/>
+        <w:jc w:val="left"/>
+        <w:rPr/>
+      </w:pPr>
+      <w:r>
+        <w:rPr/>
+        <w:t>Its (f. sg.): δική του δικής του δική του</w:t>
+      </w:r>
+    </w:p>
+    <w:p>
+      <w:pPr>
+        <w:pStyle w:val="Normal"/>
+        <w:bidi w:val="0"/>
+        <w:jc w:val="left"/>
+        <w:rPr/>
+      </w:pPr>
+      <w:r>
+        <w:rPr/>
+        <w:t>Its (f. pl.): δικές του δικών του δικές του</w:t>
+      </w:r>
+    </w:p>
+    <w:p>
+      <w:pPr>
+        <w:pStyle w:val="Normal"/>
+        <w:bidi w:val="0"/>
+        <w:jc w:val="left"/>
+        <w:rPr/>
+      </w:pPr>
+      <w:r>
+        <w:rPr/>
+        <w:t>Its (n. sg.): δικό του δικού του δικό του</w:t>
+      </w:r>
+    </w:p>
+    <w:p>
+      <w:pPr>
+        <w:pStyle w:val="Normal"/>
+        <w:bidi w:val="0"/>
+        <w:jc w:val="left"/>
+        <w:rPr/>
+      </w:pPr>
+      <w:r>
+        <w:rPr/>
+        <w:t>Its (n. pl.): δικά του δικών του δικά του</w:t>
+      </w:r>
+    </w:p>
+    <w:p>
+      <w:pPr>
+        <w:pStyle w:val="Normal"/>
+        <w:bidi w:val="0"/>
+        <w:jc w:val="left"/>
+        <w:rPr/>
+      </w:pPr>
+      <w:r>
+        <w:rPr/>
+      </w:r>
+    </w:p>
+    <w:p>
+      <w:pPr>
+        <w:pStyle w:val="Normal"/>
+        <w:bidi w:val="0"/>
+        <w:jc w:val="left"/>
+        <w:rPr/>
+      </w:pPr>
+      <w:r>
+        <w:rPr/>
+        <w:t>Ours (m. sg.): δικός μας δικού μας δικό μας</w:t>
+      </w:r>
+    </w:p>
+    <w:p>
+      <w:pPr>
+        <w:pStyle w:val="Normal"/>
+        <w:bidi w:val="0"/>
+        <w:jc w:val="left"/>
+        <w:rPr/>
+      </w:pPr>
+      <w:r>
+        <w:rPr/>
+        <w:t>Ours (m. pl.): δικοί μας δικών μας δικούς μας</w:t>
+      </w:r>
+    </w:p>
+    <w:p>
+      <w:pPr>
+        <w:pStyle w:val="Normal"/>
+        <w:bidi w:val="0"/>
+        <w:jc w:val="left"/>
+        <w:rPr/>
+      </w:pPr>
+      <w:r>
+        <w:rPr/>
+        <w:t>Ours (f. sg.): δική μας δικής μας δική μας</w:t>
+      </w:r>
+    </w:p>
+    <w:p>
+      <w:pPr>
+        <w:pStyle w:val="Normal"/>
+        <w:bidi w:val="0"/>
+        <w:jc w:val="left"/>
+        <w:rPr/>
+      </w:pPr>
+      <w:r>
+        <w:rPr/>
+        <w:t>Ours (f. pl.): δικά μας δικών μας δικά μας</w:t>
+      </w:r>
+    </w:p>
+    <w:p>
+      <w:pPr>
+        <w:pStyle w:val="Normal"/>
+        <w:bidi w:val="0"/>
+        <w:jc w:val="left"/>
+        <w:rPr/>
+      </w:pPr>
+      <w:r>
+        <w:rPr/>
+        <w:t>Ours (n. sg.): δικό μας δικού μας δικό μας</w:t>
+      </w:r>
+    </w:p>
+    <w:p>
+      <w:pPr>
+        <w:pStyle w:val="Normal"/>
+        <w:bidi w:val="0"/>
+        <w:jc w:val="left"/>
+        <w:rPr/>
+      </w:pPr>
+      <w:r>
+        <w:rPr/>
+        <w:t>Ours (n. pl.): δικά μας δικών μας δικά μας</w:t>
+      </w:r>
+    </w:p>
+    <w:p>
+      <w:pPr>
+        <w:pStyle w:val="Normal"/>
+        <w:bidi w:val="0"/>
+        <w:jc w:val="left"/>
+        <w:rPr/>
+      </w:pPr>
+      <w:r>
+        <w:rPr/>
+      </w:r>
+    </w:p>
+    <w:p>
+      <w:pPr>
+        <w:pStyle w:val="Normal"/>
+        <w:bidi w:val="0"/>
+        <w:jc w:val="left"/>
+        <w:rPr/>
+      </w:pPr>
+      <w:r>
+        <w:rPr/>
+        <w:t>Yours (m. sg.): δικός σας δικού σας δικό σας</w:t>
+      </w:r>
+    </w:p>
+    <w:p>
+      <w:pPr>
+        <w:pStyle w:val="Normal"/>
+        <w:bidi w:val="0"/>
+        <w:jc w:val="left"/>
+        <w:rPr/>
+      </w:pPr>
+      <w:r>
+        <w:rPr/>
+        <w:t>Yours (m. pl.): δικοί σας δικών σας δικούς σας</w:t>
+      </w:r>
+    </w:p>
+    <w:p>
+      <w:pPr>
+        <w:pStyle w:val="Normal"/>
+        <w:bidi w:val="0"/>
+        <w:jc w:val="left"/>
+        <w:rPr/>
+      </w:pPr>
+      <w:r>
+        <w:rPr/>
+        <w:t>Yours (f. sg.): δική σας δικής σας δική σας</w:t>
+      </w:r>
+    </w:p>
+    <w:p>
+      <w:pPr>
+        <w:pStyle w:val="Normal"/>
+        <w:bidi w:val="0"/>
+        <w:jc w:val="left"/>
+        <w:rPr/>
+      </w:pPr>
+      <w:r>
+        <w:rPr/>
+        <w:t>Yours (f. pl.): δικές σας δικών σας δικές σας</w:t>
+      </w:r>
+    </w:p>
+    <w:p>
+      <w:pPr>
+        <w:pStyle w:val="Normal"/>
+        <w:bidi w:val="0"/>
+        <w:jc w:val="left"/>
+        <w:rPr/>
+      </w:pPr>
+      <w:r>
+        <w:rPr/>
+        <w:t>Yours (n. sg.): δικό σας δικού σας δικό σας</w:t>
+      </w:r>
+    </w:p>
+    <w:p>
+      <w:pPr>
+        <w:pStyle w:val="Normal"/>
+        <w:bidi w:val="0"/>
+        <w:jc w:val="left"/>
+        <w:rPr/>
+      </w:pPr>
+      <w:r>
+        <w:rPr/>
+        <w:t>Yours (n. pl.): δικά σας δικών σας δικά σας</w:t>
+      </w:r>
+    </w:p>
+    <w:p>
+      <w:pPr>
+        <w:pStyle w:val="Normal"/>
+        <w:bidi w:val="0"/>
+        <w:jc w:val="left"/>
+        <w:rPr/>
+      </w:pPr>
+      <w:r>
+        <w:rPr/>
+      </w:r>
+    </w:p>
+    <w:p>
+      <w:pPr>
+        <w:pStyle w:val="Normal"/>
+        <w:bidi w:val="0"/>
+        <w:jc w:val="left"/>
+        <w:rPr/>
+      </w:pPr>
+      <w:r>
+        <w:rPr/>
+        <w:t>Theirs (m. sg.): δικός τους δικού τους δικό τους</w:t>
+      </w:r>
+    </w:p>
+    <w:p>
+      <w:pPr>
+        <w:pStyle w:val="Normal"/>
+        <w:bidi w:val="0"/>
+        <w:jc w:val="left"/>
+        <w:rPr/>
+      </w:pPr>
+      <w:r>
+        <w:rPr/>
+        <w:t>Theirs (m. pl.): δικοί τους δικών τους δικούς τους</w:t>
+      </w:r>
+    </w:p>
+    <w:p>
+      <w:pPr>
+        <w:pStyle w:val="Normal"/>
+        <w:bidi w:val="0"/>
+        <w:jc w:val="left"/>
+        <w:rPr/>
+      </w:pPr>
+      <w:r>
+        <w:rPr/>
+        <w:t>Theirs (f. sg.): δική τους δικής τους δική τους</w:t>
+      </w:r>
+    </w:p>
+    <w:p>
+      <w:pPr>
+        <w:pStyle w:val="Normal"/>
+        <w:bidi w:val="0"/>
+        <w:jc w:val="left"/>
+        <w:rPr/>
+      </w:pPr>
+      <w:r>
+        <w:rPr/>
+        <w:t>Theirs (f. pl.): δικές τους δικών τους δικές τους</w:t>
+      </w:r>
+    </w:p>
+    <w:p>
+      <w:pPr>
+        <w:pStyle w:val="Normal"/>
+        <w:bidi w:val="0"/>
+        <w:jc w:val="left"/>
+        <w:rPr/>
+      </w:pPr>
+      <w:r>
+        <w:rPr/>
+        <w:t>Theirs (n. sg.): δικό τους δικού τους δικό τους</w:t>
+      </w:r>
+    </w:p>
+    <w:p>
+      <w:pPr>
+        <w:pStyle w:val="Normal"/>
+        <w:bidi w:val="0"/>
+        <w:jc w:val="left"/>
+        <w:rPr/>
+      </w:pPr>
+      <w:r>
+        <w:rPr/>
+        <w:t>Theirs (n. pl.): δικά τους δικών τους δικά τους</w:t>
+      </w:r>
+    </w:p>
+    <w:p>
+      <w:pPr>
+        <w:pStyle w:val="Normal"/>
+        <w:bidi w:val="0"/>
+        <w:jc w:val="left"/>
+        <w:rPr/>
+      </w:pPr>
+      <w:r>
+        <w:rPr/>
+      </w:r>
+    </w:p>
+    <w:p>
+      <w:pPr>
+        <w:pStyle w:val="Normal"/>
+        <w:bidi w:val="0"/>
+        <w:jc w:val="left"/>
+        <w:rPr/>
+      </w:pPr>
+      <w:r>
+        <w:rPr/>
+      </w:r>
+      <w:r>
+        <w:br w:type="page"/>
+      </w:r>
+    </w:p>
+    <w:p>
+      <w:pPr>
+        <w:pStyle w:val="Normal"/>
+        <w:bidi w:val="0"/>
+        <w:jc w:val="left"/>
+        <w:rPr/>
+      </w:pPr>
+      <w:r>
+        <w:rPr/>
+        <w:t>=== Pronouns, Demonstrative ===</w:t>
+      </w:r>
+    </w:p>
+    <w:p>
+      <w:pPr>
+        <w:pStyle w:val="Normal"/>
+        <w:bidi w:val="0"/>
+        <w:jc w:val="left"/>
+        <w:rPr/>
+      </w:pPr>
+      <w:r>
+        <w:rPr/>
+      </w:r>
+    </w:p>
+    <w:p>
+      <w:pPr>
+        <w:pStyle w:val="Normal"/>
+        <w:bidi w:val="0"/>
+        <w:jc w:val="left"/>
+        <w:rPr/>
+      </w:pPr>
+      <w:r>
+        <w:rPr/>
+        <w:t xml:space="preserve">--- αυτός αυτή αυτό --- </w:t>
+      </w:r>
+    </w:p>
+    <w:p>
+      <w:pPr>
+        <w:pStyle w:val="Normal"/>
+        <w:bidi w:val="0"/>
+        <w:jc w:val="left"/>
+        <w:rPr/>
+      </w:pPr>
+      <w:r>
+        <w:rPr/>
+        <w:t>--- εκείνος εκείνη εκείνο ---</w:t>
+      </w:r>
+    </w:p>
+    <w:p>
+      <w:pPr>
+        <w:pStyle w:val="Normal"/>
+        <w:bidi w:val="0"/>
+        <w:jc w:val="left"/>
+        <w:rPr/>
+      </w:pPr>
+      <w:r>
+        <w:rPr/>
+        <w:t>--- τούτος τούτη τούτο ---</w:t>
+      </w:r>
+    </w:p>
+    <w:p>
+      <w:pPr>
+        <w:pStyle w:val="Normal"/>
+        <w:bidi w:val="0"/>
+        <w:jc w:val="left"/>
+        <w:rPr/>
+      </w:pPr>
+      <w:r>
+        <w:rPr/>
+        <w:t>--- τέτοιος τέτοια τέτοιο ---</w:t>
+      </w:r>
+    </w:p>
+    <w:p>
+      <w:pPr>
+        <w:pStyle w:val="Normal"/>
+        <w:bidi w:val="0"/>
+        <w:jc w:val="left"/>
+        <w:rPr/>
+      </w:pPr>
+      <w:r>
+        <w:rPr/>
+        <w:t>--- τόσος τόση τόσο ---</w:t>
+      </w:r>
+    </w:p>
+    <w:p>
+      <w:pPr>
+        <w:pStyle w:val="Normal"/>
+        <w:bidi w:val="0"/>
+        <w:jc w:val="left"/>
+        <w:rPr/>
+      </w:pPr>
+      <w:r>
+        <w:rPr/>
+      </w:r>
+    </w:p>
+    <w:p>
+      <w:pPr>
+        <w:pStyle w:val="Normal"/>
+        <w:bidi w:val="0"/>
+        <w:jc w:val="left"/>
+        <w:rPr/>
+      </w:pPr>
+      <w:r>
+        <w:rPr/>
+        <w:t>This (m. sg.): αυτός αυτού αυτόν</w:t>
+      </w:r>
+    </w:p>
+    <w:p>
+      <w:pPr>
+        <w:pStyle w:val="Normal"/>
+        <w:bidi w:val="0"/>
+        <w:jc w:val="left"/>
+        <w:rPr/>
+      </w:pPr>
+      <w:r>
+        <w:rPr/>
+        <w:t>This (m. pl.): αυτοί αυτών αυτούς</w:t>
+      </w:r>
+    </w:p>
+    <w:p>
+      <w:pPr>
+        <w:pStyle w:val="Normal"/>
+        <w:bidi w:val="0"/>
+        <w:jc w:val="left"/>
+        <w:rPr/>
+      </w:pPr>
+      <w:r>
+        <w:rPr/>
+        <w:t>This (f. sg.): αυτή αυτής αυτήν</w:t>
+      </w:r>
+    </w:p>
+    <w:p>
+      <w:pPr>
+        <w:pStyle w:val="Normal"/>
+        <w:bidi w:val="0"/>
+        <w:jc w:val="left"/>
+        <w:rPr/>
+      </w:pPr>
+      <w:r>
+        <w:rPr/>
+        <w:t>This (f. pl.): αυτές αυτών αυτές</w:t>
+      </w:r>
+    </w:p>
+    <w:p>
+      <w:pPr>
+        <w:pStyle w:val="Normal"/>
+        <w:bidi w:val="0"/>
+        <w:jc w:val="left"/>
+        <w:rPr/>
+      </w:pPr>
+      <w:r>
+        <w:rPr/>
+        <w:t>This (n. sg.): αυτό αυτού αυτό</w:t>
+      </w:r>
+    </w:p>
+    <w:p>
+      <w:pPr>
+        <w:pStyle w:val="Normal"/>
+        <w:bidi w:val="0"/>
+        <w:jc w:val="left"/>
+        <w:rPr/>
+      </w:pPr>
+      <w:r>
+        <w:rPr/>
+        <w:t>This (n. pl.): αυτά αυτών αυτά</w:t>
+      </w:r>
+    </w:p>
+    <w:p>
+      <w:pPr>
+        <w:pStyle w:val="Normal"/>
+        <w:bidi w:val="0"/>
+        <w:jc w:val="left"/>
+        <w:rPr/>
+      </w:pPr>
+      <w:r>
+        <w:rPr/>
+      </w:r>
+    </w:p>
+    <w:p>
+      <w:pPr>
+        <w:pStyle w:val="Normal"/>
+        <w:bidi w:val="0"/>
+        <w:jc w:val="left"/>
+        <w:rPr/>
+      </w:pPr>
+      <w:r>
+        <w:rPr/>
+        <w:t>This (m. sg.): εκείνος εκείνου εκείνο</w:t>
+      </w:r>
+    </w:p>
+    <w:p>
+      <w:pPr>
+        <w:pStyle w:val="Normal"/>
+        <w:bidi w:val="0"/>
+        <w:jc w:val="left"/>
+        <w:rPr/>
+      </w:pPr>
+      <w:r>
+        <w:rPr/>
+        <w:t>This (m. pl.): εκείνοι εκείνων εκείνους</w:t>
+      </w:r>
+    </w:p>
+    <w:p>
+      <w:pPr>
+        <w:pStyle w:val="Normal"/>
+        <w:bidi w:val="0"/>
+        <w:jc w:val="left"/>
+        <w:rPr/>
+      </w:pPr>
+      <w:r>
+        <w:rPr/>
+        <w:t>This (f. sg.): εκείνη εκείνης εκείνη</w:t>
+      </w:r>
+    </w:p>
+    <w:p>
+      <w:pPr>
+        <w:pStyle w:val="Normal"/>
+        <w:bidi w:val="0"/>
+        <w:jc w:val="left"/>
+        <w:rPr/>
+      </w:pPr>
+      <w:r>
+        <w:rPr/>
+        <w:t>This (f. pl.): εκείνες εκείνων εκείνες</w:t>
+      </w:r>
+    </w:p>
+    <w:p>
+      <w:pPr>
+        <w:pStyle w:val="Normal"/>
+        <w:bidi w:val="0"/>
+        <w:jc w:val="left"/>
+        <w:rPr/>
+      </w:pPr>
+      <w:r>
+        <w:rPr/>
+        <w:t>This (n. sg.): εκείνο εκείνου εκείνο</w:t>
+      </w:r>
+    </w:p>
+    <w:p>
+      <w:pPr>
+        <w:pStyle w:val="Normal"/>
+        <w:bidi w:val="0"/>
+        <w:jc w:val="left"/>
+        <w:rPr/>
+      </w:pPr>
+      <w:r>
+        <w:rPr/>
+        <w:t>This (n. pl.): εκείνα εκείνων εκείνα</w:t>
+      </w:r>
+    </w:p>
+    <w:p>
+      <w:pPr>
+        <w:pStyle w:val="Normal"/>
+        <w:bidi w:val="0"/>
+        <w:jc w:val="left"/>
+        <w:rPr/>
+      </w:pPr>
+      <w:r>
+        <w:rPr/>
+      </w:r>
+    </w:p>
+    <w:p>
+      <w:pPr>
+        <w:pStyle w:val="Normal"/>
+        <w:bidi w:val="0"/>
+        <w:jc w:val="left"/>
+        <w:rPr/>
+      </w:pPr>
+      <w:r>
+        <w:rPr/>
+        <w:t>This one (m. sg.): τούτος τούτου τούτο</w:t>
+      </w:r>
+    </w:p>
+    <w:p>
+      <w:pPr>
+        <w:pStyle w:val="Normal"/>
+        <w:bidi w:val="0"/>
+        <w:jc w:val="left"/>
+        <w:rPr/>
+      </w:pPr>
+      <w:r>
+        <w:rPr/>
+        <w:t>This one (m. pl.): τούτοι τούτων τούτους</w:t>
+      </w:r>
+    </w:p>
+    <w:p>
+      <w:pPr>
+        <w:pStyle w:val="Normal"/>
+        <w:bidi w:val="0"/>
+        <w:jc w:val="left"/>
+        <w:rPr/>
+      </w:pPr>
+      <w:r>
+        <w:rPr/>
+        <w:t>This one (f. sg.): τούτη τούτης τούτη</w:t>
+      </w:r>
+    </w:p>
+    <w:p>
+      <w:pPr>
+        <w:pStyle w:val="Normal"/>
+        <w:bidi w:val="0"/>
+        <w:jc w:val="left"/>
+        <w:rPr/>
+      </w:pPr>
+      <w:r>
+        <w:rPr/>
+        <w:t>This one (f. pl.): τούτες τούτων τούτες</w:t>
+      </w:r>
+    </w:p>
+    <w:p>
+      <w:pPr>
+        <w:pStyle w:val="Normal"/>
+        <w:bidi w:val="0"/>
+        <w:jc w:val="left"/>
+        <w:rPr/>
+      </w:pPr>
+      <w:r>
+        <w:rPr/>
+        <w:t>This one (n. sg.): τούτο τούτου τούτο</w:t>
+      </w:r>
+    </w:p>
+    <w:p>
+      <w:pPr>
+        <w:pStyle w:val="Normal"/>
+        <w:bidi w:val="0"/>
+        <w:jc w:val="left"/>
+        <w:rPr/>
+      </w:pPr>
+      <w:r>
+        <w:rPr/>
+        <w:t>This one (n. pl.): τούτα τούτων τούτα</w:t>
+      </w:r>
+    </w:p>
+    <w:p>
+      <w:pPr>
+        <w:pStyle w:val="Normal"/>
+        <w:bidi w:val="0"/>
+        <w:jc w:val="left"/>
+        <w:rPr/>
+      </w:pPr>
+      <w:r>
+        <w:rPr/>
+      </w:r>
+    </w:p>
+    <w:p>
+      <w:pPr>
+        <w:pStyle w:val="Normal"/>
+        <w:bidi w:val="0"/>
+        <w:jc w:val="left"/>
+        <w:rPr/>
+      </w:pPr>
+      <w:r>
+        <w:rPr/>
+        <w:t>Such a (m. sg.): τέτοιος τέτοιου τέτοιο</w:t>
+      </w:r>
+    </w:p>
+    <w:p>
+      <w:pPr>
+        <w:pStyle w:val="Normal"/>
+        <w:bidi w:val="0"/>
+        <w:jc w:val="left"/>
+        <w:rPr/>
+      </w:pPr>
+      <w:r>
+        <w:rPr/>
+        <w:t>Such a (m. pl.): τέτοιοι τέτοιων τέτοιους</w:t>
+      </w:r>
+    </w:p>
+    <w:p>
+      <w:pPr>
+        <w:pStyle w:val="Normal"/>
+        <w:bidi w:val="0"/>
+        <w:jc w:val="left"/>
+        <w:rPr/>
+      </w:pPr>
+      <w:r>
+        <w:rPr/>
+        <w:t>Such a (f. sg.): τέτοια τέτοιας τέτοια</w:t>
+      </w:r>
+    </w:p>
+    <w:p>
+      <w:pPr>
+        <w:pStyle w:val="Normal"/>
+        <w:bidi w:val="0"/>
+        <w:jc w:val="left"/>
+        <w:rPr/>
+      </w:pPr>
+      <w:r>
+        <w:rPr/>
+        <w:t>Such a (f. pl.): τέτοιες τέτοιων τέτοιες</w:t>
+      </w:r>
+    </w:p>
+    <w:p>
+      <w:pPr>
+        <w:pStyle w:val="Normal"/>
+        <w:bidi w:val="0"/>
+        <w:jc w:val="left"/>
+        <w:rPr/>
+      </w:pPr>
+      <w:r>
+        <w:rPr/>
+        <w:t>Such a (n. sg.): τέτοιο τέτοιου τέτοιο</w:t>
+      </w:r>
+    </w:p>
+    <w:p>
+      <w:pPr>
+        <w:pStyle w:val="Normal"/>
+        <w:bidi w:val="0"/>
+        <w:jc w:val="left"/>
+        <w:rPr/>
+      </w:pPr>
+      <w:r>
+        <w:rPr/>
+        <w:t>Such a (n. pl.): τέτοια τέτοιων τέτοια</w:t>
+      </w:r>
+    </w:p>
+    <w:p>
+      <w:pPr>
+        <w:pStyle w:val="Normal"/>
+        <w:bidi w:val="0"/>
+        <w:jc w:val="left"/>
+        <w:rPr/>
+      </w:pPr>
+      <w:r>
+        <w:rPr/>
+      </w:r>
+    </w:p>
+    <w:p>
+      <w:pPr>
+        <w:pStyle w:val="Normal"/>
+        <w:bidi w:val="0"/>
+        <w:jc w:val="left"/>
+        <w:rPr/>
+      </w:pPr>
+      <w:r>
+        <w:rPr/>
+        <w:t>So as (m. sg.): τόσος τόσου τόσο</w:t>
+      </w:r>
+    </w:p>
+    <w:p>
+      <w:pPr>
+        <w:pStyle w:val="Normal"/>
+        <w:bidi w:val="0"/>
+        <w:jc w:val="left"/>
+        <w:rPr/>
+      </w:pPr>
+      <w:r>
+        <w:rPr/>
+        <w:t>So as (m. pl.): τόσοι τόσων τόσους</w:t>
+      </w:r>
+    </w:p>
+    <w:p>
+      <w:pPr>
+        <w:pStyle w:val="Normal"/>
+        <w:bidi w:val="0"/>
+        <w:jc w:val="left"/>
+        <w:rPr/>
+      </w:pPr>
+      <w:r>
+        <w:rPr/>
+        <w:t>So as (f. sg.): τόση τόσης τόση</w:t>
+      </w:r>
+    </w:p>
+    <w:p>
+      <w:pPr>
+        <w:pStyle w:val="Normal"/>
+        <w:bidi w:val="0"/>
+        <w:jc w:val="left"/>
+        <w:rPr/>
+      </w:pPr>
+      <w:r>
+        <w:rPr/>
+        <w:t>So as (f. pl.): τόσες τόσων τόσες</w:t>
+      </w:r>
+    </w:p>
+    <w:p>
+      <w:pPr>
+        <w:pStyle w:val="Normal"/>
+        <w:bidi w:val="0"/>
+        <w:jc w:val="left"/>
+        <w:rPr/>
+      </w:pPr>
+      <w:r>
+        <w:rPr/>
+        <w:t>So as (n. sg.): τόσο τόσου τόσο</w:t>
+      </w:r>
+    </w:p>
+    <w:p>
+      <w:pPr>
+        <w:pStyle w:val="Normal"/>
+        <w:bidi w:val="0"/>
+        <w:jc w:val="left"/>
+        <w:rPr/>
+      </w:pPr>
+      <w:r>
+        <w:rPr/>
+        <w:t>So as (n. pl.): τόσα τόσων τόσα</w:t>
+      </w:r>
+    </w:p>
+    <w:p>
+      <w:pPr>
+        <w:pStyle w:val="Normal"/>
+        <w:bidi w:val="0"/>
+        <w:jc w:val="left"/>
+        <w:rPr/>
+      </w:pPr>
+      <w:r>
+        <w:rPr/>
+      </w:r>
+    </w:p>
+    <w:p>
+      <w:pPr>
+        <w:pStyle w:val="Normal"/>
+        <w:bidi w:val="0"/>
+        <w:jc w:val="left"/>
+        <w:rPr/>
+      </w:pPr>
+      <w:r>
+        <w:rPr/>
+      </w:r>
+      <w:r>
+        <w:br w:type="page"/>
+      </w:r>
+    </w:p>
+    <w:p>
+      <w:pPr>
+        <w:pStyle w:val="Normal"/>
+        <w:bidi w:val="0"/>
+        <w:jc w:val="left"/>
+        <w:rPr/>
+      </w:pPr>
+      <w:r>
+        <w:rPr/>
+        <w:t>=== Pronouns, Reflexive ===</w:t>
+      </w:r>
+    </w:p>
+    <w:p>
+      <w:pPr>
+        <w:pStyle w:val="Normal"/>
+        <w:bidi w:val="0"/>
+        <w:jc w:val="left"/>
+        <w:rPr/>
+      </w:pPr>
+      <w:r>
+        <w:rPr/>
+      </w:r>
+    </w:p>
+    <w:p>
+      <w:pPr>
+        <w:pStyle w:val="Normal"/>
+        <w:bidi w:val="0"/>
+        <w:jc w:val="left"/>
+        <w:rPr/>
+      </w:pPr>
+      <w:r>
+        <w:rPr/>
+        <w:t>--- 1-st person reflexive ο εαυτός μου ---</w:t>
+      </w:r>
+    </w:p>
+    <w:p>
+      <w:pPr>
+        <w:pStyle w:val="Normal"/>
+        <w:bidi w:val="0"/>
+        <w:jc w:val="left"/>
+        <w:rPr/>
+      </w:pPr>
+      <w:r>
+        <w:rPr/>
+        <w:t>--- 2-nd person reflexive σ εαυτός σου ---</w:t>
+      </w:r>
+    </w:p>
+    <w:p>
+      <w:pPr>
+        <w:pStyle w:val="Normal"/>
+        <w:bidi w:val="0"/>
+        <w:jc w:val="left"/>
+        <w:rPr/>
+      </w:pPr>
+      <w:r>
+        <w:rPr/>
+        <w:t>--- 3-rd person reflexive σ εαυτός του σ εαυτός της σ εαυτός του ---</w:t>
+      </w:r>
+    </w:p>
+    <w:p>
+      <w:pPr>
+        <w:pStyle w:val="Normal"/>
+        <w:bidi w:val="0"/>
+        <w:jc w:val="left"/>
+        <w:rPr/>
+      </w:pPr>
+      <w:r>
+        <w:rPr/>
+      </w:r>
+    </w:p>
+    <w:p>
+      <w:pPr>
+        <w:pStyle w:val="Normal"/>
+        <w:bidi w:val="0"/>
+        <w:jc w:val="left"/>
+        <w:rPr/>
+      </w:pPr>
+      <w:r>
+        <w:rPr/>
+        <w:t>Myself (m-f-n. sg.): ο εαυτός μου του εαυτού μου τον εαυτό μου</w:t>
+      </w:r>
+    </w:p>
+    <w:p>
+      <w:pPr>
+        <w:pStyle w:val="Normal"/>
+        <w:bidi w:val="0"/>
+        <w:jc w:val="left"/>
+        <w:rPr/>
+      </w:pPr>
+      <w:r>
+        <w:rPr/>
+        <w:t>Myself (m-f-n. pl.): ο εαυτός μας του εαυτού μας τον εαυτό μας</w:t>
+      </w:r>
+    </w:p>
+    <w:p>
+      <w:pPr>
+        <w:pStyle w:val="Normal"/>
+        <w:bidi w:val="0"/>
+        <w:jc w:val="left"/>
+        <w:rPr/>
+      </w:pPr>
+      <w:r>
+        <w:rPr/>
+      </w:r>
+    </w:p>
+    <w:p>
+      <w:pPr>
+        <w:pStyle w:val="Normal"/>
+        <w:bidi w:val="0"/>
+        <w:jc w:val="left"/>
+        <w:rPr/>
+      </w:pPr>
+      <w:r>
+        <w:rPr/>
+        <w:t>Yourself (m-f-n. sg.): ο εαυτός σου του εαυτού σου τον εαυτό σου</w:t>
+      </w:r>
+    </w:p>
+    <w:p>
+      <w:pPr>
+        <w:pStyle w:val="Normal"/>
+        <w:bidi w:val="0"/>
+        <w:jc w:val="left"/>
+        <w:rPr/>
+      </w:pPr>
+      <w:r>
+        <w:rPr/>
+        <w:t>Yourself (m-f-n. pl.): ο εαυτός σας του εαυτού σας τον εαυτό σας</w:t>
+      </w:r>
+    </w:p>
+    <w:p>
+      <w:pPr>
+        <w:pStyle w:val="Normal"/>
+        <w:bidi w:val="0"/>
+        <w:jc w:val="left"/>
+        <w:rPr/>
+      </w:pPr>
+      <w:r>
+        <w:rPr/>
+      </w:r>
+    </w:p>
+    <w:p>
+      <w:pPr>
+        <w:pStyle w:val="Normal"/>
+        <w:bidi w:val="0"/>
+        <w:jc w:val="left"/>
+        <w:rPr/>
+      </w:pPr>
+      <w:r>
+        <w:rPr/>
+        <w:t>Himself (m. sg.): ο εαυτός του του εαυτού του τον εαυτό του</w:t>
+      </w:r>
+    </w:p>
+    <w:p>
+      <w:pPr>
+        <w:pStyle w:val="Normal"/>
+        <w:bidi w:val="0"/>
+        <w:jc w:val="left"/>
+        <w:rPr/>
+      </w:pPr>
+      <w:r>
+        <w:rPr/>
+        <w:t>Himself (m. pl.): ο εαυτός τους του εαυτού τους τον εαυτό τους</w:t>
+      </w:r>
+    </w:p>
+    <w:p>
+      <w:pPr>
+        <w:pStyle w:val="Normal"/>
+        <w:bidi w:val="0"/>
+        <w:jc w:val="left"/>
+        <w:rPr/>
+      </w:pPr>
+      <w:r>
+        <w:rPr/>
+        <w:t>Himself (f. sg.): ο εαυτός της του εαυτού της τον εαυτό της</w:t>
+      </w:r>
+    </w:p>
+    <w:p>
+      <w:pPr>
+        <w:pStyle w:val="Normal"/>
+        <w:bidi w:val="0"/>
+        <w:jc w:val="left"/>
+        <w:rPr/>
+      </w:pPr>
+      <w:r>
+        <w:rPr/>
+        <w:t>Himself (f. pl.): ο εαυτός τους του εαυτού τους τον εαυτό τους</w:t>
+      </w:r>
+    </w:p>
+    <w:p>
+      <w:pPr>
+        <w:pStyle w:val="Normal"/>
+        <w:bidi w:val="0"/>
+        <w:jc w:val="left"/>
+        <w:rPr/>
+      </w:pPr>
+      <w:r>
+        <w:rPr/>
+        <w:t>Himself (n. pl.): ο εαυτός του του εαυτού του τον εαυτό του</w:t>
+      </w:r>
+    </w:p>
+    <w:p>
+      <w:pPr>
+        <w:pStyle w:val="Normal"/>
+        <w:bidi w:val="0"/>
+        <w:jc w:val="left"/>
+        <w:rPr/>
+      </w:pPr>
+      <w:r>
+        <w:rPr/>
+        <w:t>Himself (n. sg.): ο εαυτός τους του εαυτού τους τον εαυτό τους</w:t>
+      </w:r>
+    </w:p>
+    <w:p>
+      <w:pPr>
+        <w:pStyle w:val="Normal"/>
+        <w:bidi w:val="0"/>
+        <w:jc w:val="left"/>
+        <w:rPr/>
+      </w:pPr>
+      <w:r>
+        <w:rPr/>
+      </w:r>
+    </w:p>
+    <w:p>
+      <w:pPr>
+        <w:pStyle w:val="Normal"/>
+        <w:bidi w:val="0"/>
+        <w:jc w:val="left"/>
+        <w:rPr/>
+      </w:pPr>
+      <w:r>
+        <w:rPr/>
+      </w:r>
+      <w:r>
+        <w:br w:type="page"/>
+      </w:r>
+    </w:p>
+    <w:p>
+      <w:pPr>
+        <w:pStyle w:val="Normal"/>
+        <w:bidi w:val="0"/>
+        <w:jc w:val="left"/>
+        <w:rPr/>
+      </w:pPr>
+      <w:r>
+        <w:rPr/>
+        <w:t>=== Pronouns, Definite ===</w:t>
+      </w:r>
+    </w:p>
+    <w:p>
+      <w:pPr>
+        <w:pStyle w:val="Normal"/>
+        <w:bidi w:val="0"/>
+        <w:jc w:val="left"/>
+        <w:rPr/>
+      </w:pPr>
+      <w:r>
+        <w:rPr/>
+      </w:r>
+    </w:p>
+    <w:p>
+      <w:pPr>
+        <w:pStyle w:val="Normal"/>
+        <w:bidi w:val="0"/>
+        <w:jc w:val="left"/>
+        <w:rPr/>
+      </w:pPr>
+      <w:r>
+        <w:rPr/>
+        <w:t>--- ο ίδιος η ίδια το ίδιο ---</w:t>
+      </w:r>
+    </w:p>
+    <w:p>
+      <w:pPr>
+        <w:pStyle w:val="Normal"/>
+        <w:bidi w:val="0"/>
+        <w:jc w:val="left"/>
+        <w:rPr/>
+      </w:pPr>
+      <w:r>
+        <w:rPr/>
+        <w:t>--- 1-st person μόνος μου μόνη μου μονο μου ---</w:t>
+      </w:r>
+    </w:p>
+    <w:p>
+      <w:pPr>
+        <w:pStyle w:val="Normal"/>
+        <w:bidi w:val="0"/>
+        <w:jc w:val="left"/>
+        <w:rPr/>
+      </w:pPr>
+      <w:r>
+        <w:rPr/>
+        <w:t>--- 2-nd person μόνος σου μόνη σου μονο σου ---</w:t>
+      </w:r>
+    </w:p>
+    <w:p>
+      <w:pPr>
+        <w:pStyle w:val="Normal"/>
+        <w:bidi w:val="0"/>
+        <w:jc w:val="left"/>
+        <w:rPr/>
+      </w:pPr>
+      <w:r>
+        <w:rPr/>
+        <w:t>--- 3-rd person μόνος του μόνη ης μονο του  ---</w:t>
+      </w:r>
+    </w:p>
+    <w:p>
+      <w:pPr>
+        <w:pStyle w:val="Normal"/>
+        <w:bidi w:val="0"/>
+        <w:jc w:val="left"/>
+        <w:rPr/>
+      </w:pPr>
+      <w:r>
+        <w:rPr/>
+      </w:r>
+    </w:p>
+    <w:p>
+      <w:pPr>
+        <w:pStyle w:val="Normal"/>
+        <w:bidi w:val="0"/>
+        <w:jc w:val="left"/>
+        <w:rPr/>
+      </w:pPr>
+      <w:r>
+        <w:rPr/>
+        <w:t>Myself (m. sg.): ο ίδιος του ίδιου τον ίδιο</w:t>
+      </w:r>
+    </w:p>
+    <w:p>
+      <w:pPr>
+        <w:pStyle w:val="Normal"/>
+        <w:bidi w:val="0"/>
+        <w:jc w:val="left"/>
+        <w:rPr/>
+      </w:pPr>
+      <w:r>
+        <w:rPr/>
+        <w:t>Myself (m. pl.): οι ίδιοι των ίδιων τους ίδιους</w:t>
+      </w:r>
+    </w:p>
+    <w:p>
+      <w:pPr>
+        <w:pStyle w:val="Normal"/>
+        <w:bidi w:val="0"/>
+        <w:jc w:val="left"/>
+        <w:rPr/>
+      </w:pPr>
+      <w:r>
+        <w:rPr/>
+        <w:t>Myself (f. sg.): η ίδια της ίδιας την ίδια</w:t>
+      </w:r>
+    </w:p>
+    <w:p>
+      <w:pPr>
+        <w:pStyle w:val="Normal"/>
+        <w:bidi w:val="0"/>
+        <w:jc w:val="left"/>
+        <w:rPr/>
+      </w:pPr>
+      <w:r>
+        <w:rPr/>
+        <w:t>Myself (f. pl.): οι ίδιες των ίδιων τις ίδιες</w:t>
+      </w:r>
+    </w:p>
+    <w:p>
+      <w:pPr>
+        <w:pStyle w:val="Normal"/>
+        <w:bidi w:val="0"/>
+        <w:jc w:val="left"/>
+        <w:rPr/>
+      </w:pPr>
+      <w:r>
+        <w:rPr/>
+        <w:t>Myself (n. sg.): το ίδιο του ίδιου το ίδιο</w:t>
+      </w:r>
+    </w:p>
+    <w:p>
+      <w:pPr>
+        <w:pStyle w:val="Normal"/>
+        <w:bidi w:val="0"/>
+        <w:jc w:val="left"/>
+        <w:rPr/>
+      </w:pPr>
+      <w:r>
+        <w:rPr/>
+        <w:t>Myself (n. pl.): τα ίδια των ίδιων τα ίδια</w:t>
+      </w:r>
+    </w:p>
+    <w:p>
+      <w:pPr>
+        <w:pStyle w:val="Normal"/>
+        <w:bidi w:val="0"/>
+        <w:jc w:val="left"/>
+        <w:rPr/>
+      </w:pPr>
+      <w:r>
+        <w:rPr/>
+      </w:r>
+    </w:p>
+    <w:p>
+      <w:pPr>
+        <w:pStyle w:val="Normal"/>
+        <w:bidi w:val="0"/>
+        <w:jc w:val="left"/>
+        <w:rPr/>
+      </w:pPr>
+      <w:r>
+        <w:rPr/>
+        <w:t>By myself (m. sg.): μόνος μου μόνου μου μόνο μου</w:t>
+      </w:r>
+    </w:p>
+    <w:p>
+      <w:pPr>
+        <w:pStyle w:val="Normal"/>
+        <w:bidi w:val="0"/>
+        <w:jc w:val="left"/>
+        <w:rPr/>
+      </w:pPr>
+      <w:r>
+        <w:rPr/>
+        <w:t>By myself (m. pl.): μόνοι μας μόνων μας μόνους μας</w:t>
+      </w:r>
+    </w:p>
+    <w:p>
+      <w:pPr>
+        <w:pStyle w:val="Normal"/>
+        <w:bidi w:val="0"/>
+        <w:jc w:val="left"/>
+        <w:rPr/>
+      </w:pPr>
+      <w:r>
+        <w:rPr/>
+        <w:t>By myself (f. sg.): μόνη μου μόνης μου μόνη μου</w:t>
+      </w:r>
+    </w:p>
+    <w:p>
+      <w:pPr>
+        <w:pStyle w:val="Normal"/>
+        <w:bidi w:val="0"/>
+        <w:jc w:val="left"/>
+        <w:rPr/>
+      </w:pPr>
+      <w:r>
+        <w:rPr/>
+        <w:t>By myself (f. pl.): μόνες μας μόνων μας μόνες μας</w:t>
+      </w:r>
+    </w:p>
+    <w:p>
+      <w:pPr>
+        <w:pStyle w:val="Normal"/>
+        <w:bidi w:val="0"/>
+        <w:jc w:val="left"/>
+        <w:rPr/>
+      </w:pPr>
+      <w:r>
+        <w:rPr/>
+        <w:t>By myself (m. sg.): μόνο μου μόνου μου μόνο μου</w:t>
+      </w:r>
+    </w:p>
+    <w:p>
+      <w:pPr>
+        <w:pStyle w:val="Normal"/>
+        <w:bidi w:val="0"/>
+        <w:jc w:val="left"/>
+        <w:rPr/>
+      </w:pPr>
+      <w:r>
+        <w:rPr/>
+        <w:t>By myself (m. pl.): μόνα μας μόνων μας μόνα μας</w:t>
+      </w:r>
+    </w:p>
+    <w:p>
+      <w:pPr>
+        <w:pStyle w:val="Normal"/>
+        <w:bidi w:val="0"/>
+        <w:jc w:val="left"/>
+        <w:rPr/>
+      </w:pPr>
+      <w:r>
+        <w:rPr/>
+      </w:r>
+    </w:p>
+    <w:p>
+      <w:pPr>
+        <w:pStyle w:val="Normal"/>
+        <w:bidi w:val="0"/>
+        <w:jc w:val="left"/>
+        <w:rPr/>
+      </w:pPr>
+      <w:r>
+        <w:rPr/>
+        <w:t>By yourself (m. sg.): μόνος σου μόνου σου μόνο σου</w:t>
+      </w:r>
+    </w:p>
+    <w:p>
+      <w:pPr>
+        <w:pStyle w:val="Normal"/>
+        <w:bidi w:val="0"/>
+        <w:jc w:val="left"/>
+        <w:rPr/>
+      </w:pPr>
+      <w:r>
+        <w:rPr/>
+        <w:t>By yourself (m. pl.): μόνοι σας μόνων σας μόνους σας</w:t>
+      </w:r>
+    </w:p>
+    <w:p>
+      <w:pPr>
+        <w:pStyle w:val="Normal"/>
+        <w:bidi w:val="0"/>
+        <w:jc w:val="left"/>
+        <w:rPr/>
+      </w:pPr>
+      <w:r>
+        <w:rPr/>
+        <w:t>By yourself (f. sg.): μόνη σου μόνης σου μόνη σου</w:t>
+      </w:r>
+    </w:p>
+    <w:p>
+      <w:pPr>
+        <w:pStyle w:val="Normal"/>
+        <w:bidi w:val="0"/>
+        <w:jc w:val="left"/>
+        <w:rPr/>
+      </w:pPr>
+      <w:r>
+        <w:rPr/>
+        <w:t>By yourself (f. pl.): μόνες σας μόνων σας μόνες σας</w:t>
+      </w:r>
+    </w:p>
+    <w:p>
+      <w:pPr>
+        <w:pStyle w:val="Normal"/>
+        <w:bidi w:val="0"/>
+        <w:jc w:val="left"/>
+        <w:rPr/>
+      </w:pPr>
+      <w:r>
+        <w:rPr/>
+        <w:t>By yourself (m. sg.): μόνο σου μόνου σου μόνο σου</w:t>
+      </w:r>
+    </w:p>
+    <w:p>
+      <w:pPr>
+        <w:pStyle w:val="Normal"/>
+        <w:bidi w:val="0"/>
+        <w:jc w:val="left"/>
+        <w:rPr/>
+      </w:pPr>
+      <w:r>
+        <w:rPr/>
+        <w:t>By yourself (m. pl.): μόνα σας μόνων σας μόνα σας</w:t>
+      </w:r>
+    </w:p>
+    <w:p>
+      <w:pPr>
+        <w:pStyle w:val="Normal"/>
+        <w:bidi w:val="0"/>
+        <w:jc w:val="left"/>
+        <w:rPr/>
+      </w:pPr>
+      <w:r>
+        <w:rPr/>
+      </w:r>
+    </w:p>
+    <w:p>
+      <w:pPr>
+        <w:pStyle w:val="Normal"/>
+        <w:bidi w:val="0"/>
+        <w:jc w:val="left"/>
+        <w:rPr/>
+      </w:pPr>
+      <w:r>
+        <w:rPr/>
+        <w:t>By himself (m. sg.): μόνος του μόνου του μόνο του</w:t>
+      </w:r>
+    </w:p>
+    <w:p>
+      <w:pPr>
+        <w:pStyle w:val="Normal"/>
+        <w:bidi w:val="0"/>
+        <w:jc w:val="left"/>
+        <w:rPr/>
+      </w:pPr>
+      <w:r>
+        <w:rPr/>
+        <w:t>By himself (m. pl.): μόνοι τους μόνων τους μόνους τους</w:t>
+      </w:r>
+    </w:p>
+    <w:p>
+      <w:pPr>
+        <w:pStyle w:val="Normal"/>
+        <w:bidi w:val="0"/>
+        <w:jc w:val="left"/>
+        <w:rPr/>
+      </w:pPr>
+      <w:r>
+        <w:rPr/>
+        <w:t>By himself (f. sg.): μόνη της μόνης της μόνη της</w:t>
+      </w:r>
+    </w:p>
+    <w:p>
+      <w:pPr>
+        <w:pStyle w:val="Normal"/>
+        <w:bidi w:val="0"/>
+        <w:jc w:val="left"/>
+        <w:rPr/>
+      </w:pPr>
+      <w:r>
+        <w:rPr/>
+        <w:t>By himself (f. pl.): μόνες τους μόνων τους μόνες τους</w:t>
+      </w:r>
+    </w:p>
+    <w:p>
+      <w:pPr>
+        <w:pStyle w:val="Normal"/>
+        <w:bidi w:val="0"/>
+        <w:jc w:val="left"/>
+        <w:rPr/>
+      </w:pPr>
+      <w:r>
+        <w:rPr/>
+        <w:t>By himself (m. sg.): μόνο του μόνου του μόνο του</w:t>
+      </w:r>
+    </w:p>
+    <w:p>
+      <w:pPr>
+        <w:pStyle w:val="Normal"/>
+        <w:bidi w:val="0"/>
+        <w:jc w:val="left"/>
+        <w:rPr/>
+      </w:pPr>
+      <w:r>
+        <w:rPr/>
+        <w:t>By himself (m. pl.): μόνα τους μόνων τους μόνα τους</w:t>
+      </w:r>
+    </w:p>
+    <w:p>
+      <w:pPr>
+        <w:pStyle w:val="Normal"/>
+        <w:bidi w:val="0"/>
+        <w:jc w:val="left"/>
+        <w:rPr/>
+      </w:pPr>
+      <w:r>
+        <w:rPr/>
+      </w:r>
+    </w:p>
+    <w:p>
+      <w:pPr>
+        <w:pStyle w:val="Normal"/>
+        <w:bidi w:val="0"/>
+        <w:jc w:val="left"/>
+        <w:rPr/>
+      </w:pPr>
+      <w:r>
+        <w:rPr/>
+      </w:r>
+      <w:r>
+        <w:br w:type="page"/>
+      </w:r>
+    </w:p>
+    <w:p>
+      <w:pPr>
+        <w:pStyle w:val="Normal"/>
+        <w:bidi w:val="0"/>
+        <w:jc w:val="left"/>
+        <w:rPr/>
+      </w:pPr>
+      <w:r>
+        <w:rPr/>
+        <w:t>=== Pronouns, Interrogative ===</w:t>
+      </w:r>
+    </w:p>
+    <w:p>
+      <w:pPr>
+        <w:pStyle w:val="Normal"/>
+        <w:bidi w:val="0"/>
+        <w:jc w:val="left"/>
+        <w:rPr/>
+      </w:pPr>
+      <w:r>
+        <w:rPr/>
+      </w:r>
+    </w:p>
+    <w:p>
+      <w:pPr>
+        <w:pStyle w:val="Normal"/>
+        <w:bidi w:val="0"/>
+        <w:jc w:val="left"/>
+        <w:rPr/>
+      </w:pPr>
+      <w:r>
+        <w:rPr/>
+        <w:t>--- ποιος ποια ποιο ---</w:t>
+      </w:r>
+    </w:p>
+    <w:p>
+      <w:pPr>
+        <w:pStyle w:val="Normal"/>
+        <w:bidi w:val="0"/>
+        <w:jc w:val="left"/>
+        <w:rPr/>
+      </w:pPr>
+      <w:r>
+        <w:rPr/>
+        <w:t>--- πόσος πόση πόσο ---</w:t>
+      </w:r>
+    </w:p>
+    <w:p>
+      <w:pPr>
+        <w:pStyle w:val="Normal"/>
+        <w:bidi w:val="0"/>
+        <w:jc w:val="left"/>
+        <w:rPr/>
+      </w:pPr>
+      <w:r>
+        <w:rPr/>
+      </w:r>
+    </w:p>
+    <w:p>
+      <w:pPr>
+        <w:pStyle w:val="Normal"/>
+        <w:bidi w:val="0"/>
+        <w:jc w:val="left"/>
+        <w:rPr/>
+      </w:pPr>
+      <w:r>
+        <w:rPr/>
+        <w:t>Who (m. sg.): ποιος ποιου ποιο</w:t>
+      </w:r>
+    </w:p>
+    <w:p>
+      <w:pPr>
+        <w:pStyle w:val="Normal"/>
+        <w:bidi w:val="0"/>
+        <w:jc w:val="left"/>
+        <w:rPr/>
+      </w:pPr>
+      <w:r>
+        <w:rPr/>
+        <w:t>Who (m. pl.): ποιοι ποιων ποιους</w:t>
+      </w:r>
+    </w:p>
+    <w:p>
+      <w:pPr>
+        <w:pStyle w:val="Normal"/>
+        <w:bidi w:val="0"/>
+        <w:jc w:val="left"/>
+        <w:rPr/>
+      </w:pPr>
+      <w:r>
+        <w:rPr/>
+        <w:t>Who (f. sg.): ποια ποιας ποια</w:t>
+      </w:r>
+    </w:p>
+    <w:p>
+      <w:pPr>
+        <w:pStyle w:val="Normal"/>
+        <w:bidi w:val="0"/>
+        <w:jc w:val="left"/>
+        <w:rPr/>
+      </w:pPr>
+      <w:r>
+        <w:rPr/>
+        <w:t>Who (f. pl.): ποιες ποιων ποιες</w:t>
+      </w:r>
+    </w:p>
+    <w:p>
+      <w:pPr>
+        <w:pStyle w:val="Normal"/>
+        <w:bidi w:val="0"/>
+        <w:jc w:val="left"/>
+        <w:rPr/>
+      </w:pPr>
+      <w:r>
+        <w:rPr/>
+        <w:t>Who (n. sg.): ποιο ποιου ποιο</w:t>
+      </w:r>
+    </w:p>
+    <w:p>
+      <w:pPr>
+        <w:pStyle w:val="Normal"/>
+        <w:bidi w:val="0"/>
+        <w:jc w:val="left"/>
+        <w:rPr/>
+      </w:pPr>
+      <w:r>
+        <w:rPr/>
+        <w:t>Who (n. pl.): ποια ποιων ποια</w:t>
+      </w:r>
+    </w:p>
+    <w:p>
+      <w:pPr>
+        <w:pStyle w:val="Normal"/>
+        <w:bidi w:val="0"/>
+        <w:jc w:val="left"/>
+        <w:rPr/>
+      </w:pPr>
+      <w:r>
+        <w:rPr/>
+      </w:r>
+    </w:p>
+    <w:p>
+      <w:pPr>
+        <w:pStyle w:val="Normal"/>
+        <w:bidi w:val="0"/>
+        <w:jc w:val="left"/>
+        <w:rPr/>
+      </w:pPr>
+      <w:r>
+        <w:rPr/>
+        <w:t>How many (m. sg.): πόσος πόσου πόσο</w:t>
+      </w:r>
+    </w:p>
+    <w:p>
+      <w:pPr>
+        <w:pStyle w:val="Normal"/>
+        <w:bidi w:val="0"/>
+        <w:jc w:val="left"/>
+        <w:rPr/>
+      </w:pPr>
+      <w:r>
+        <w:rPr/>
+        <w:t>How many (m. pl.): πόσοι πόσων πόσους</w:t>
+      </w:r>
+    </w:p>
+    <w:p>
+      <w:pPr>
+        <w:pStyle w:val="Normal"/>
+        <w:bidi w:val="0"/>
+        <w:jc w:val="left"/>
+        <w:rPr/>
+      </w:pPr>
+      <w:r>
+        <w:rPr/>
+        <w:t>How many (f. sg.): πόση πόσης πόση</w:t>
+      </w:r>
+    </w:p>
+    <w:p>
+      <w:pPr>
+        <w:pStyle w:val="Normal"/>
+        <w:bidi w:val="0"/>
+        <w:jc w:val="left"/>
+        <w:rPr/>
+      </w:pPr>
+      <w:r>
+        <w:rPr/>
+        <w:t>How many (f. pl.): πόσες πόσων πόσες</w:t>
+      </w:r>
+    </w:p>
+    <w:p>
+      <w:pPr>
+        <w:pStyle w:val="Normal"/>
+        <w:bidi w:val="0"/>
+        <w:jc w:val="left"/>
+        <w:rPr/>
+      </w:pPr>
+      <w:r>
+        <w:rPr/>
+        <w:t>How many (n. sg.): πόσο πόσου πόσο</w:t>
+      </w:r>
+    </w:p>
+    <w:p>
+      <w:pPr>
+        <w:pStyle w:val="Normal"/>
+        <w:bidi w:val="0"/>
+        <w:jc w:val="left"/>
+        <w:rPr/>
+      </w:pPr>
+      <w:r>
+        <w:rPr/>
+        <w:t>How many (n. pl.): πόσα πόσων πόσα</w:t>
+      </w:r>
+    </w:p>
+    <w:p>
+      <w:pPr>
+        <w:pStyle w:val="Normal"/>
+        <w:bidi w:val="0"/>
+        <w:jc w:val="left"/>
+        <w:rPr/>
+      </w:pPr>
+      <w:r>
+        <w:rPr/>
+      </w:r>
+    </w:p>
+    <w:p>
+      <w:pPr>
+        <w:pStyle w:val="Normal"/>
+        <w:bidi w:val="0"/>
+        <w:jc w:val="left"/>
+        <w:rPr/>
+      </w:pPr>
+      <w:r>
+        <w:rPr/>
+      </w:r>
+      <w:r>
+        <w:br w:type="page"/>
+      </w:r>
+    </w:p>
+    <w:p>
+      <w:pPr>
+        <w:pStyle w:val="Normal"/>
+        <w:bidi w:val="0"/>
+        <w:jc w:val="left"/>
+        <w:rPr/>
+      </w:pPr>
+      <w:r>
+        <w:rPr/>
+        <w:t>=== Pronouns, Indefinite ===</w:t>
+      </w:r>
+    </w:p>
+    <w:p>
+      <w:pPr>
+        <w:pStyle w:val="Normal"/>
+        <w:bidi w:val="0"/>
+        <w:jc w:val="left"/>
+        <w:rPr/>
+      </w:pPr>
+      <w:r>
+        <w:rPr/>
+      </w:r>
+    </w:p>
+    <w:p>
+      <w:pPr>
+        <w:pStyle w:val="Normal"/>
+        <w:bidi w:val="0"/>
+        <w:jc w:val="left"/>
+        <w:rPr/>
+      </w:pPr>
+      <w:r>
+        <w:rPr/>
+        <w:t>--- ένας μία ένα ---</w:t>
+      </w:r>
+    </w:p>
+    <w:p>
+      <w:pPr>
+        <w:pStyle w:val="Normal"/>
+        <w:bidi w:val="0"/>
+        <w:jc w:val="left"/>
+        <w:rPr/>
+      </w:pPr>
+      <w:r>
+        <w:rPr/>
+        <w:t>--- κανένας καμία κανένα ---</w:t>
+      </w:r>
+    </w:p>
+    <w:p>
+      <w:pPr>
+        <w:pStyle w:val="Normal"/>
+        <w:bidi w:val="0"/>
+        <w:jc w:val="left"/>
+        <w:rPr/>
+      </w:pPr>
+      <w:r>
+        <w:rPr/>
+        <w:t>--- καθένας καθεμία καθένα ---</w:t>
+      </w:r>
+    </w:p>
+    <w:p>
+      <w:pPr>
+        <w:pStyle w:val="Normal"/>
+        <w:bidi w:val="0"/>
+        <w:jc w:val="left"/>
+        <w:rPr/>
+      </w:pPr>
+      <w:r>
+        <w:rPr/>
+        <w:t>--- κάποιος κάποια κάποιο ---</w:t>
+      </w:r>
+    </w:p>
+    <w:p>
+      <w:pPr>
+        <w:pStyle w:val="Normal"/>
+        <w:bidi w:val="0"/>
+        <w:jc w:val="left"/>
+        <w:rPr/>
+      </w:pPr>
+      <w:r>
+        <w:rPr/>
+        <w:t>--- κάμποσος κάμποση κάμποσο ---</w:t>
+      </w:r>
+    </w:p>
+    <w:p>
+      <w:pPr>
+        <w:pStyle w:val="Normal"/>
+        <w:bidi w:val="0"/>
+        <w:jc w:val="left"/>
+        <w:rPr/>
+      </w:pPr>
+      <w:r>
+        <w:rPr/>
+        <w:t>--- μερικοί μερικές μερικά ---</w:t>
+      </w:r>
+    </w:p>
+    <w:p>
+      <w:pPr>
+        <w:pStyle w:val="Normal"/>
+        <w:bidi w:val="0"/>
+        <w:jc w:val="left"/>
+        <w:rPr/>
+      </w:pPr>
+      <w:r>
+        <w:rPr/>
+      </w:r>
+    </w:p>
+    <w:p>
+      <w:pPr>
+        <w:pStyle w:val="Normal"/>
+        <w:bidi w:val="0"/>
+        <w:jc w:val="left"/>
+        <w:rPr/>
+      </w:pPr>
+      <w:r>
+        <w:rPr/>
+        <w:t>Someone (m. sg.): ένας ενός έναν</w:t>
+      </w:r>
+    </w:p>
+    <w:p>
+      <w:pPr>
+        <w:pStyle w:val="Normal"/>
+        <w:bidi w:val="0"/>
+        <w:jc w:val="left"/>
+        <w:rPr/>
+      </w:pPr>
+      <w:r>
+        <w:rPr/>
+        <w:t>Someone (f. sg.): μία μίας μίαν</w:t>
+      </w:r>
+    </w:p>
+    <w:p>
+      <w:pPr>
+        <w:pStyle w:val="Normal"/>
+        <w:bidi w:val="0"/>
+        <w:jc w:val="left"/>
+        <w:rPr/>
+      </w:pPr>
+      <w:r>
+        <w:rPr/>
+        <w:t>Someone (n. sg.): ένα ενός ένα</w:t>
+      </w:r>
+    </w:p>
+    <w:p>
+      <w:pPr>
+        <w:pStyle w:val="Normal"/>
+        <w:bidi w:val="0"/>
+        <w:jc w:val="left"/>
+        <w:rPr/>
+      </w:pPr>
+      <w:r>
+        <w:rPr/>
+      </w:r>
+    </w:p>
+    <w:p>
+      <w:pPr>
+        <w:pStyle w:val="Normal"/>
+        <w:bidi w:val="0"/>
+        <w:jc w:val="left"/>
+        <w:rPr/>
+      </w:pPr>
+      <w:r>
+        <w:rPr/>
+        <w:t xml:space="preserve">No one (m. sg.): κανένας κανενός κανένα </w:t>
+      </w:r>
+    </w:p>
+    <w:p>
+      <w:pPr>
+        <w:pStyle w:val="Normal"/>
+        <w:bidi w:val="0"/>
+        <w:jc w:val="left"/>
+        <w:rPr/>
+      </w:pPr>
+      <w:r>
+        <w:rPr/>
+        <w:t>No one (f. sg.): καμία καμίας καμία</w:t>
+      </w:r>
+    </w:p>
+    <w:p>
+      <w:pPr>
+        <w:pStyle w:val="Normal"/>
+        <w:bidi w:val="0"/>
+        <w:jc w:val="left"/>
+        <w:rPr/>
+      </w:pPr>
+      <w:r>
+        <w:rPr/>
+        <w:t>No one (n. sg.): κανένα κανενός κανένα</w:t>
+      </w:r>
+    </w:p>
+    <w:p>
+      <w:pPr>
+        <w:pStyle w:val="Normal"/>
+        <w:bidi w:val="0"/>
+        <w:jc w:val="left"/>
+        <w:rPr/>
+      </w:pPr>
+      <w:r>
+        <w:rPr/>
+      </w:r>
+    </w:p>
+    <w:p>
+      <w:pPr>
+        <w:pStyle w:val="Normal"/>
+        <w:bidi w:val="0"/>
+        <w:jc w:val="left"/>
+        <w:rPr/>
+      </w:pPr>
+      <w:r>
+        <w:rPr/>
+        <w:t>Each (m. sg.): καθένας καθενός καθένα</w:t>
+      </w:r>
+    </w:p>
+    <w:p>
+      <w:pPr>
+        <w:pStyle w:val="Normal"/>
+        <w:bidi w:val="0"/>
+        <w:jc w:val="left"/>
+        <w:rPr/>
+      </w:pPr>
+      <w:r>
+        <w:rPr/>
+        <w:t>Each (f. sg.): καθεμία καθεμίας καθεμία</w:t>
+      </w:r>
+    </w:p>
+    <w:p>
+      <w:pPr>
+        <w:pStyle w:val="Normal"/>
+        <w:bidi w:val="0"/>
+        <w:jc w:val="left"/>
+        <w:rPr/>
+      </w:pPr>
+      <w:r>
+        <w:rPr/>
+        <w:t>Each (n. sg.): καθένα καθενός καθένα</w:t>
+      </w:r>
+    </w:p>
+    <w:p>
+      <w:pPr>
+        <w:pStyle w:val="Normal"/>
+        <w:bidi w:val="0"/>
+        <w:jc w:val="left"/>
+        <w:rPr/>
+      </w:pPr>
+      <w:r>
+        <w:rPr/>
+      </w:r>
+    </w:p>
+    <w:p>
+      <w:pPr>
+        <w:pStyle w:val="Normal"/>
+        <w:bidi w:val="0"/>
+        <w:jc w:val="left"/>
+        <w:rPr/>
+      </w:pPr>
+      <w:r>
+        <w:rPr/>
+        <w:t>Someone (m. sg.): κάποιος κάποιου κάποιο</w:t>
+      </w:r>
+    </w:p>
+    <w:p>
+      <w:pPr>
+        <w:pStyle w:val="Normal"/>
+        <w:bidi w:val="0"/>
+        <w:jc w:val="left"/>
+        <w:rPr/>
+      </w:pPr>
+      <w:r>
+        <w:rPr/>
+        <w:t>Someone (m. pl.): κάποιοι κάποιων κάποιους</w:t>
+      </w:r>
+    </w:p>
+    <w:p>
+      <w:pPr>
+        <w:pStyle w:val="Normal"/>
+        <w:bidi w:val="0"/>
+        <w:jc w:val="left"/>
+        <w:rPr/>
+      </w:pPr>
+      <w:r>
+        <w:rPr/>
+        <w:t>Someone (f. sg.): κάποια κάποιας κάποια</w:t>
+      </w:r>
+    </w:p>
+    <w:p>
+      <w:pPr>
+        <w:pStyle w:val="Normal"/>
+        <w:bidi w:val="0"/>
+        <w:jc w:val="left"/>
+        <w:rPr/>
+      </w:pPr>
+      <w:r>
+        <w:rPr/>
+        <w:t>Someone (f. pl.): κάποιες κάποιων κάποιες</w:t>
+      </w:r>
+    </w:p>
+    <w:p>
+      <w:pPr>
+        <w:pStyle w:val="Normal"/>
+        <w:bidi w:val="0"/>
+        <w:jc w:val="left"/>
+        <w:rPr/>
+      </w:pPr>
+      <w:r>
+        <w:rPr/>
+        <w:t>Someone (n. sg.): κάποιο κάποιου κάποιο</w:t>
+      </w:r>
+    </w:p>
+    <w:p>
+      <w:pPr>
+        <w:pStyle w:val="Normal"/>
+        <w:bidi w:val="0"/>
+        <w:jc w:val="left"/>
+        <w:rPr/>
+      </w:pPr>
+      <w:r>
+        <w:rPr/>
+        <w:t>Someone (n. pl.): κάποια κάποιων κάποια</w:t>
+      </w:r>
+    </w:p>
+    <w:p>
+      <w:pPr>
+        <w:pStyle w:val="Normal"/>
+        <w:bidi w:val="0"/>
+        <w:jc w:val="left"/>
+        <w:rPr/>
+      </w:pPr>
+      <w:r>
+        <w:rPr/>
+      </w:r>
+    </w:p>
+    <w:p>
+      <w:pPr>
+        <w:pStyle w:val="Normal"/>
+        <w:bidi w:val="0"/>
+        <w:jc w:val="left"/>
+        <w:rPr/>
+      </w:pPr>
+      <w:r>
+        <w:rPr/>
+        <w:t>Fair number of (m. sg.): κάμποσος κάμποσου κάμποσο</w:t>
+      </w:r>
+    </w:p>
+    <w:p>
+      <w:pPr>
+        <w:pStyle w:val="Normal"/>
+        <w:bidi w:val="0"/>
+        <w:jc w:val="left"/>
+        <w:rPr/>
+      </w:pPr>
+      <w:r>
+        <w:rPr/>
+        <w:t>Fair number of (m. pl.): κάμποσοι κάμποσων κάμποσους</w:t>
+      </w:r>
+    </w:p>
+    <w:p>
+      <w:pPr>
+        <w:pStyle w:val="Normal"/>
+        <w:bidi w:val="0"/>
+        <w:jc w:val="left"/>
+        <w:rPr/>
+      </w:pPr>
+      <w:r>
+        <w:rPr/>
+        <w:t>Fair number of (f. sg.): κάμποση κάμποσης κάμποση</w:t>
+      </w:r>
+    </w:p>
+    <w:p>
+      <w:pPr>
+        <w:pStyle w:val="Normal"/>
+        <w:bidi w:val="0"/>
+        <w:jc w:val="left"/>
+        <w:rPr/>
+      </w:pPr>
+      <w:r>
+        <w:rPr/>
+        <w:t>Fair number of (f. pl.): κάμποσες κάμποσων κάμποσες</w:t>
+      </w:r>
+    </w:p>
+    <w:p>
+      <w:pPr>
+        <w:pStyle w:val="Normal"/>
+        <w:bidi w:val="0"/>
+        <w:jc w:val="left"/>
+        <w:rPr/>
+      </w:pPr>
+      <w:r>
+        <w:rPr/>
+        <w:t>Fair number of (n. sg.): κάμποσο κάμποσου κάμποσο</w:t>
+      </w:r>
+    </w:p>
+    <w:p>
+      <w:pPr>
+        <w:pStyle w:val="Normal"/>
+        <w:bidi w:val="0"/>
+        <w:jc w:val="left"/>
+        <w:rPr/>
+      </w:pPr>
+      <w:r>
+        <w:rPr/>
+        <w:t>Fair number of (n. pl.): κάμποσα κάμποσων κάμποσα</w:t>
+      </w:r>
+    </w:p>
+    <w:p>
+      <w:pPr>
+        <w:pStyle w:val="Normal"/>
+        <w:bidi w:val="0"/>
+        <w:jc w:val="left"/>
+        <w:rPr/>
+      </w:pPr>
+      <w:r>
+        <w:rPr/>
+      </w:r>
+    </w:p>
+    <w:p>
+      <w:pPr>
+        <w:pStyle w:val="Normal"/>
+        <w:bidi w:val="0"/>
+        <w:jc w:val="left"/>
+        <w:rPr/>
+      </w:pPr>
+      <w:r>
+        <w:rPr/>
+        <w:t>Some (m. pl.): μερικοί μερικών μερικούς</w:t>
+      </w:r>
+    </w:p>
+    <w:p>
+      <w:pPr>
+        <w:pStyle w:val="Normal"/>
+        <w:bidi w:val="0"/>
+        <w:jc w:val="left"/>
+        <w:rPr/>
+      </w:pPr>
+      <w:r>
+        <w:rPr/>
+        <w:t>Some (f. pl.): μερικές μερικών μερικές</w:t>
+      </w:r>
+    </w:p>
+    <w:p>
+      <w:pPr>
+        <w:pStyle w:val="Normal"/>
+        <w:bidi w:val="0"/>
+        <w:jc w:val="left"/>
+        <w:rPr/>
+      </w:pPr>
+      <w:r>
+        <w:rPr/>
+        <w:t>Some (n. pl.): μερικά μερικών μερικά</w:t>
+      </w:r>
+      <w:r>
+        <w:br w:type="page"/>
       </w:r>
     </w:p>
     <w:p>
@@ -16648,7 +19905,7 @@
     </w:r>
     <w:r>
       <w:rPr/>
-      <w:t>10</w:t>
+      <w:t>19</w:t>
     </w:r>
     <w:r>
       <w:rPr/>

</xml_diff>